<commit_message>
Update chapter compositions, scripts, and book content
Batch update across all chapters: revised docx files,
updated composition/pruned/refined JSON, and improved
batch_chapters.py and chapter.py processing scripts.

Co-Authored-By: Claude Opus 4.6 <noreply@anthropic.com>
</commit_message>
<xml_diff>
--- a/chapters/bhantes-own-story/chapter-preprint-refined.docx
+++ b/chapters/bhantes-own-story/chapter-preprint-refined.docx
@@ -96,7 +96,7 @@
           <w:color w:val="1A1A1A"/>
           <w:sz w:val="56"/>
         </w:rPr>
-        <w:t>Bhante's Own Story</w:t>
+        <w:t>Stumbling Toward the Island</w:t>
       </w:r>
     </w:p>
     <w:p>
@@ -110,7 +110,7 @@
           <w:color w:val="444444"/>
           <w:sz w:val="28"/>
         </w:rPr>
-        <w:t>A 70th Birthday Reflection</w:t>
+        <w:t>A Life of Catastrophes, Blessings, and the Path to Liberation</w:t>
       </w:r>
     </w:p>
     <w:p>
@@ -138,7 +138,7 @@
           <w:color w:val="444444"/>
           <w:sz w:val="22"/>
         </w:rPr>
-        <w:t>« I wake and feel the fell of dark, not day. »</w:t>
+        <w:t>« Just think, if all this, one day, all this one day, one fine day, just think, if one day, one fine day, all this stopped. »</w:t>
       </w:r>
     </w:p>
     <w:p>
@@ -196,7 +196,7 @@
           <w:color w:val="1A1A1A"/>
           <w:sz w:val="40"/>
         </w:rPr>
-        <w:t>Bhante's Own Story</w:t>
+        <w:t>Stumbling Toward the Island</w:t>
       </w:r>
     </w:p>
     <w:p>
@@ -210,7 +210,7 @@
           <w:color w:val="444444"/>
           <w:sz w:val="24"/>
         </w:rPr>
-        <w:t>A 70th Birthday Reflection</w:t>
+        <w:t>A Life of Catastrophes, Blessings, and the Path to Liberation</w:t>
       </w:r>
     </w:p>
     <w:p>
@@ -273,7 +273,21 @@
           <w:color w:val="1A1A1A"/>
           <w:sz w:val="24"/>
         </w:rPr>
-        <w:t>Something peculiar has happened to me this year, in the sense that suddenly—I suppose it's reaching the end of all this building stuff here, too, and feeling very settled outside Satipanya—memories of my past life came up. I mean this one. Of my past living. And I just wondered how it is that I got to this place. So I thought it was an opportunity, really, to answer the questions that I'm often asked, but I usually palm off with a sentence or two. How I became a Buddhist, how I became a monk, and why do I continue?</w:t>
+        <w:t>Something peculiar has happened to me this year, in the sense that, suddenly—I suppose it's reaching the end of all this building stuff here, too, and feeling very settled outside Satipañña—memories of my past life came up. I mean this one. Of my past living. And I just wondered how it is that I got to this place.</w:t>
+      </w:r>
+    </w:p>
+    <w:p>
+      <w:pPr>
+        <w:spacing w:line="336" w:lineRule="auto" w:after="0"/>
+        <w:ind w:firstLine="454"/>
+        <w:jc w:val="both"/>
+      </w:pPr>
+      <w:r>
+        <w:rPr>
+          <w:color w:val="1A1A1A"/>
+          <w:sz w:val="24"/>
+        </w:rPr>
+        <w:t>I thought it was an opportunity, really, to answer the questions that I'm often asked, but usually palm off with a sentence or two. How I became a Buddhist, how I became a monk, and why do I continue?</w:t>
       </w:r>
     </w:p>
     <w:p>
@@ -343,7 +357,21 @@
           <w:color w:val="1A1A1A"/>
           <w:sz w:val="24"/>
         </w:rPr>
-        <w:t>The effect of birth upon us. Consider the Buddha. As soon as he was born, his mother died. So there must be a feeling there of loss, whether the baby's fully aware of it or not. There must be a feeling of loss. And according to certain disciplines like rebirthing—that breathing thing—and Stan Grof's holotropic breathing, the birth trauma has a real effect upon us. It's there within our psyche.</w:t>
+        <w:t>The effect of birth upon us. Consider the Buddha. As soon as he was born, his mother died. So there must be a feeling there of loss, whether the baby's fully aware of it or not. There must be a feeling of loss.</w:t>
+      </w:r>
+    </w:p>
+    <w:p>
+      <w:pPr>
+        <w:spacing w:line="336" w:lineRule="auto" w:after="0"/>
+        <w:ind w:firstLine="454"/>
+        <w:jc w:val="both"/>
+      </w:pPr>
+      <w:r>
+        <w:rPr>
+          <w:color w:val="1A1A1A"/>
+          <w:sz w:val="24"/>
+        </w:rPr>
+        <w:t>And according to certain disciplines like rebirthing—that breathing thing—and Stan Grof's holotropic breathing, the birth trauma has a real effect upon us. It's there within our psyche.</w:t>
       </w:r>
     </w:p>
     <w:p>
@@ -399,7 +427,21 @@
           <w:color w:val="1A1A1A"/>
           <w:sz w:val="24"/>
         </w:rPr>
-        <w:t>This was my introduction into devotion. I was in ecstasy. And it's something that I think a lot of children these days don't get. Not that they don't get it with other things like pop stars and things like that. But it was my introduction into religion as a real heart-based experience. And this was to carry on. If my first catastrophe was birth, this was my first blessing.</w:t>
+        <w:t>This was my introduction into devotion. I was in ecstasy. And it's something that I think a lot of children these days don't get. Not that they don't get it with other things like pop stars and things like that. But it was my introduction into religion as a real heart-based experience. And this was to carry on.</w:t>
+      </w:r>
+    </w:p>
+    <w:p>
+      <w:pPr>
+        <w:spacing w:line="336" w:lineRule="auto" w:after="0"/>
+        <w:ind w:firstLine="454"/>
+        <w:jc w:val="both"/>
+      </w:pPr>
+      <w:r>
+        <w:rPr>
+          <w:color w:val="1A1A1A"/>
+          <w:sz w:val="24"/>
+        </w:rPr>
+        <w:t>That was, I call, if my first catastrophe was birth, this was my first blessing.</w:t>
       </w:r>
     </w:p>
     <w:p>
@@ -441,7 +483,7 @@
           <w:color w:val="1A1A1A"/>
           <w:sz w:val="24"/>
         </w:rPr>
-        <w:t>When you go to Thailand, you'll see little children are brought into the monastery, into the temples, and they bow, and they also have this sandalwood and incense, and they have the chanting. That sense of devotion, which is a beautiful emotional state, a mental state of praise, of being in a lovely spaced-out place—it's absolutely glorious. And of course you can develop these things into absorptions.</w:t>
+        <w:t>When you go to Thailand, you'll see little children are brought into the monastery, into the temples, and they bow, and they also have this sandalwood and incense, and they have the chanting. That sense of devotion, which is a beautiful emotional state, a mental state of praise, of being in a lovely spaced-out place, it's absolutely glorious. And of course you can develop these things into absorptions.</w:t>
       </w:r>
     </w:p>
     <w:p>
@@ -455,7 +497,7 @@
           <w:color w:val="1A1A1A"/>
           <w:sz w:val="24"/>
         </w:rPr>
-        <w:t>That's very difficult for us because it's a different culture. We haven't got that sort of background. So I always think the way into a devotional, a heart connection with the Buddhist teaching is through gratitude. And the more that you consider what the teaching has done for you and for others, the more this gratitude comes up. And it's very simple to go from gratitude towards love, towards a relationship.</w:t>
+        <w:t>That's very difficult for us because it's a different culture. We haven't got that sort of background. So I always think the way into a devotional, a heart connection with the Buddhist teaching, is through gratitude. And the more that you consider what the teaching has done for you and for others, then you get this gratitude come up. And it's very simple to go from gratitude towards love, towards a relationship.</w:t>
       </w:r>
     </w:p>
     <w:p>
@@ -469,7 +511,7 @@
           <w:color w:val="1A1A1A"/>
           <w:sz w:val="24"/>
         </w:rPr>
-        <w:t>Now, of course, the Buddha is gone. It's not as though we're relating to the Buddha. What we're relating to is an image within us of the Buddha. And in growing that, in a sense, we're actually forming a devotional relationship to the Buddha within us that we want to become. It's the Buddha as he appears in daily life. It's not the transcendent Buddha. It's the Buddha of compassion, of love, of joy. And that's why I've got all these statues. That's the idea of devotion. I'm trying to squeeze a bit of Dhamma out of my autobiography.</w:t>
+        <w:t>Now, of course, the Buddha is gone. It's not as though we're relating to the Buddha. What we're relating to is an image within us of the Buddha. And in growing that, in a sense, we're actually forming a devotional relationship to the Buddha within us that we want to become. So it's the Buddha as he appears in daily life. It's not the transcendent Buddha. It's the Buddha of compassion, of love, of joy. And that's why I've got all these statues. That's the idea of devotion.</w:t>
       </w:r>
     </w:p>
     <w:p>
@@ -483,7 +525,7 @@
           <w:color w:val="1A1A1A"/>
           <w:sz w:val="24"/>
         </w:rPr>
-        <w:t>Anyway, we moved then to North Manchester, which was all fields at that time, out of Deangate, Moston into the lovely fields. The fields didn't stay fields long. They were soon built on. And right at the back of us, they established a cemetery.</w:t>
+        <w:t>Anyway, we moved then to North Manchester, which was all fields at that time, out of Deangate Mostyn into the lovely fields. The fields didn't stay fields long. They were soon built on. And right at the back of us, they established a cemetery.</w:t>
       </w:r>
     </w:p>
     <w:p>
@@ -497,7 +539,7 @@
           <w:color w:val="1A1A1A"/>
           <w:sz w:val="24"/>
         </w:rPr>
-        <w:t>While I was at primary school, a priest turned up. He gave us this wonderful talk with pictures about the missions. He showed us pictures of Flores, which is a beautiful island in Indonesia. He showed us pictures about New Guinea. And he showed us pictures about South America. He talked about the wonderful things that priests did out there, missionaries. And if anybody felt like they might be drawn to that sort of thing, then they should get in contact.</w:t>
+        <w:t>Then, while I was at primary school, a priest turned up. And he gave us this wonderful talk with pictures about the missions. He showed us pictures of Flores, which is a beautiful island in Indonesia. He showed us pictures about New Guinea. And he showed us pictures about South America. And he talked about the wonderful things that priests did out there, missionaries. And if anybody felt like they might be drawn to that sort of thing, then they should get in contact.</w:t>
       </w:r>
     </w:p>
     <w:p>
@@ -511,7 +553,7 @@
           <w:color w:val="1A1A1A"/>
           <w:sz w:val="24"/>
         </w:rPr>
-        <w:t>I got the eleven-plus and went to Xaverian College, which was a grammar school. But two of my friends from that school went to St Richard's College. And during that year, for some reason, it came to me that that's what I wanted to do. My mother was fiercely against it, but my father was like that, and it was my Aunt Rose who really wanted a priest in the family.</w:t>
+        <w:t>Anyway, I got the 11-plus and I went to Xaverian College, which was a grammar school. But two of my friends from that school went to St. Richard's College. And during that year, for some reason, it came to me that that's what I wanted to do. My mother was fiercely against it, but my father was like that, and it was my Aunt Rose who really wanted a priest in the family.</w:t>
       </w:r>
     </w:p>
     <w:p>
@@ -525,7 +567,7 @@
           <w:color w:val="1A1A1A"/>
           <w:sz w:val="24"/>
         </w:rPr>
-        <w:t>Come the age of twelve, I'm off on the train down to St Richard's College. And for me, it was entering into two years of undiluted heaven, because it was all about doing exactly what you want to do. And that's when you're most happy, isn't it? When you're doing exactly what you want to do in an unpressured situation, you're in perfect joy. Correct? For instance, a hobby.</w:t>
+        <w:t>Come the age of twelve, I'm off on the train down to St. Richard's College. And for me, it was entering into two years of undiluted heaven, because it was all about doing exactly what you want to do. And that's when you're most happy, isn't it? When you're doing exactly what you want to do in an unpressured situation, you're in perfect joy. Correct? For instance, a hobby.</w:t>
       </w:r>
     </w:p>
     <w:p>
@@ -539,7 +581,7 @@
           <w:color w:val="1A1A1A"/>
           <w:sz w:val="24"/>
         </w:rPr>
-        <w:t>The routine there was up about half past six, seven o'clock. We went down for mass. After mass, we went out in most weathers, only in the most severe, to do the old army exercises. Back in, into breakfast, clean up. School starts nine o'clock, all the way through to five o'clock. And all that time, apart from a little break at lunch, I remember it was in silence. Can you imagine that for a twelve-year-old these days? At six o'clock, we went in to study, and at eight o'clock, we were finally let free and we could play games down in the big game room. Imagine a twelve-year-old's day like that today.</w:t>
+        <w:t>The routine there was up about half past six, seven o'clock. We went down for mass. After mass, we went out in most weathers—only in the most severe did we stay in—to do the old army exercises. Back in, into breakfast, clean up. School starts nine o'clock, all the way through to five o'clock. And all that time, apart from a little break at lunch, I remember it was in silence. Can you imagine that for a twelve-year-old these days?</w:t>
       </w:r>
     </w:p>
     <w:p>
@@ -581,7 +623,7 @@
           <w:color w:val="1A1A1A"/>
           <w:sz w:val="24"/>
         </w:rPr>
-        <w:t>We were let out every so often to go for a walk on a Sunday. And there were about six of us, five of us on the trip. As we got down, we suddenly had this idea that we'd smoke. Now, teenagers are by nature rebellious. The order didn't smoke. It was a German order begun by a German priest, mainly German and American. And the joke was, we don't smoke, so we drink. S-V-D. So it was a sort of little rebellion to go and get some cigarettes.</w:t>
+        <w:t>Anyway, we were let out every so often to go for a walk on a Sunday. And there were about six of us, five of us on the trip. And as we got down, we suddenly had this idea that we'd smoke. Now, teenagers are by nature rebellious. The order didn't smoke. And it was a German order begun by a German priest. And it was mainly German and American. And the joke was, we don't smoke, so we drink. S-V-D.</w:t>
       </w:r>
     </w:p>
     <w:p>
@@ -595,7 +637,7 @@
           <w:color w:val="1A1A1A"/>
           <w:sz w:val="24"/>
         </w:rPr>
-        <w:t>And we decided to steal them. There was an old lady who ran a shop at this bridge on the Worcester Canal. As we entered, we'd had it all figured out: somebody distracted her and somebody took the cigarettes. I can't remember what my job was. And I daren't. So I'll leave that.</w:t>
+        <w:t>And so it was a little rebellion to go and get some cigarettes. And we decided to steal them. There was an old lady who ran a shop at this bridge on the Worcester Canal. And as we entered in, we'd had it all figured out: somebody distracted her and somebody took the cigarettes. And I can't remember what my job was. And I daren't. So I'll leave that.</w:t>
       </w:r>
     </w:p>
     <w:p>
@@ -609,7 +651,7 @@
           <w:color w:val="1A1A1A"/>
           <w:sz w:val="24"/>
         </w:rPr>
-        <w:t>Well, we smoked, of course. And when we got back in the evening after lunch, we were all called to the prefect's office, one headmaster prefect. He asked us, had we taken cigarettes from this lady? And we all said yes. She was no fool, eh? We were probably the only customers the whole day. There was nobody, that in the middle of nowhere.</w:t>
+        <w:t>Well, we smoked, of course. And when we got back in the evening after lunch, we were all called to the prefect's office, one headmaster prefect. And he asked us, had we taken cigarettes from this lady? And we all said yes. She was no fool, eh? We were probably the only customers the whole day. There was nobody—that was in the middle of nowhere.</w:t>
       </w:r>
     </w:p>
     <w:p>
@@ -623,7 +665,21 @@
           <w:color w:val="1A1A1A"/>
           <w:sz w:val="24"/>
         </w:rPr>
-        <w:t>We were dismissed, and we thought, well, that's it. There was no corporal punishment in the seminary at all. If I was at Xaverian, you'd have been beaten. About a day or so later, we were all called for a talk in this big classroom. And the rector, who was in charge of the whole place, announced that certain boys had stolen. He called our names and said, you are expelled.</w:t>
+        <w:t>So we were dismissed, and we thought, well, that's it. There was no corporal punishment in the seminary at all. If I was at Xaverian, you'd have been beaten.</w:t>
+      </w:r>
+    </w:p>
+    <w:p>
+      <w:pPr>
+        <w:spacing w:line="336" w:lineRule="auto" w:after="0"/>
+        <w:ind w:firstLine="454"/>
+        <w:jc w:val="both"/>
+      </w:pPr>
+      <w:r>
+        <w:rPr>
+          <w:color w:val="1A1A1A"/>
+          <w:sz w:val="24"/>
+        </w:rPr>
+        <w:t>Anyway, about a day or so later, we were all called for a talk in this big classroom. And the rector, who was in charge of the whole place, announced that certain boys had stolen. And he called our names and he said, you are expelled.</w:t>
       </w:r>
     </w:p>
     <w:p>
@@ -651,7 +707,7 @@
           <w:color w:val="1A1A1A"/>
           <w:sz w:val="24"/>
         </w:rPr>
-        <w:t>I got back and because of that, my GCEs went all over the place. I had about four GCEs. I had to take my English again. And unfortunately, because the education was mainly by Americans, who I don't think really understood the English GCE system at the time, I ended up with subjects that I had virtually no interest in. Latin, French, and history. I had a bit of interest in history. And so life went on. I didn't do well at the GCEs.</w:t>
+        <w:t>Anyway, I got back and because of that, my GCEs went all over the place. I had about four GCEs. I had to take my English again. And unfortunately, because the education was mainly by Americans, who I don't think really understood the English GCE system at the time, I ended up with subjects that I had virtually no interest in. Latin, French, and history. I had a bit of interest in history. And so life went on. And I didn't do well at the GCEs.</w:t>
       </w:r>
     </w:p>
     <w:p>
@@ -665,7 +721,7 @@
           <w:color w:val="1A1A1A"/>
           <w:sz w:val="24"/>
         </w:rPr>
-        <w:t>I remember talking to my father about this. When I was thrown out, that was a cut-off of a vocation. This vocation to be a priest remained in me as a really strong, tremendous urge for three years till I was over nineteen. Why couldn't I go back? Why couldn't I go back?</w:t>
+        <w:t>And I remember talking to my father about this. Now, when I was thrown out, that was a cutting off of a vocation. This vocation to be a priest remained in me as a really strong, tremendous urge for three years till I was over nineteen.</w:t>
       </w:r>
     </w:p>
     <w:p>
@@ -679,7 +735,7 @@
           <w:color w:val="1A1A1A"/>
           <w:sz w:val="24"/>
         </w:rPr>
-        <w:t>It's because they never forgave me. I can't tell you how important it is to forgive your enemies. What happened was, come the GCE, I turned up and they gave me a room in an outer building. I had to go into the exam room at a different entrance from everybody else. I wasn't allowed to talk to anybody and they weren't allowed to talk to me. In other words, I was excommunicated. And there was no way you can come back on that.</w:t>
+        <w:t>Why couldn't I go back? Why couldn't I go back? It's because they never forgave me.</w:t>
       </w:r>
     </w:p>
     <w:p>
@@ -693,7 +749,7 @@
           <w:color w:val="1A1A1A"/>
           <w:sz w:val="24"/>
         </w:rPr>
-        <w:t>If a priest or somebody had come up and said, look, give it a couple of years and then you can join another order, I'd have had an in. But I had this block. I couldn't move. So if you have any pity on your enemies, on all of them, do forgive them because it allows them to forgive themselves. And of course, in our offering forgiveness, we empty our own hearts of the revenge and the hurt and all that sort of stuff. Now, it doesn't mean to say that you've got to have somebody's forgiveness in order to forgive yourself, but it just makes it much easier.</w:t>
+        <w:t>I can't tell you how important it is to forgive your enemies. What happened was, come the GCE, I turned up and they gave me a room in an outer building. I had to go into the exam room at a different entrance from everybody else. I wasn't allowed to talk to anybody and they weren't allowed to talk to me. In other words, I was excommunicated. And there was no way you can come back on that.</w:t>
       </w:r>
     </w:p>
     <w:p>
@@ -707,7 +763,7 @@
           <w:color w:val="1A1A1A"/>
           <w:sz w:val="24"/>
         </w:rPr>
-        <w:t>I went on then to about nineteen, and my father pointed out to me that since I was lost, I had no clue what to do with my life at this point. I'm completely lost. He said, why don't you teach? He said, you can travel with teaching. They must have known I was unsettled.</w:t>
+        <w:t>If a priest or somebody had come up and said, look, give it a couple of years and then you can join another order—I'd have had an in. But I had this block. I couldn't move.</w:t>
       </w:r>
     </w:p>
     <w:p>
@@ -721,7 +777,35 @@
           <w:color w:val="1A1A1A"/>
           <w:sz w:val="24"/>
         </w:rPr>
-        <w:t>I decided, I didn't go into university, so I went down to St Mary's College, which was then a Catholic training college. It's now a university. It was the year they were introducing the B.Ed. And instead of doing the B.Ed., I did the other offering, which was a degree course and a teacher training course.</w:t>
+        <w:t>So if you have any pity on your enemies, on all of them, do forgive them because it allows them to forgive themselves. And of course, in our offering forgiveness, we empty our own hearts of the revenge and the hurt and all that. Now, it doesn't mean to say that you've got to have somebody's forgiveness in order to forgive yourself, but it just makes it much easier.</w:t>
+      </w:r>
+    </w:p>
+    <w:p>
+      <w:pPr>
+        <w:spacing w:line="336" w:lineRule="auto" w:after="0"/>
+        <w:ind w:firstLine="454"/>
+        <w:jc w:val="both"/>
+      </w:pPr>
+      <w:r>
+        <w:rPr>
+          <w:color w:val="1A1A1A"/>
+          <w:sz w:val="24"/>
+        </w:rPr>
+        <w:t>So I went on then to about nineteen, and my father pointed out to me that since I was lost—I had no clue what to do with my life at this point, completely lost—he said, why don't you teach? He said, you can travel with teaching. They must have known I was unsettled.</w:t>
+      </w:r>
+    </w:p>
+    <w:p>
+      <w:pPr>
+        <w:spacing w:line="336" w:lineRule="auto" w:after="0"/>
+        <w:ind w:firstLine="454"/>
+        <w:jc w:val="both"/>
+      </w:pPr>
+      <w:r>
+        <w:rPr>
+          <w:color w:val="1A1A1A"/>
+          <w:sz w:val="24"/>
+        </w:rPr>
+        <w:t>So I decided—I didn't go into university—I went down to St. Mary's College, which was then a Catholic training college. It's now a university. And it was the year they were introducing the B.Ed. Instead of doing the B.Ed., I did the other offering, which was a degree course and a teacher training course.</w:t>
       </w:r>
     </w:p>
     <w:p>
@@ -749,7 +833,21 @@
           <w:color w:val="1A1A1A"/>
           <w:sz w:val="24"/>
         </w:rPr>
-        <w:t>And that went on for a little while until... it was during that time I fell in love. Oh my goodness. Well, you know what the first time is. So I'm completely sozzled, right? And on one steamy, love-drenched night, she fell pregnant. This was my third catastrophe.</w:t>
+        <w:t>And that went on for a little while until... It was during that time I fell in love. Oh my goodness. Well, you know what the first time is. So I'm completely sozzled, right?</w:t>
+      </w:r>
+    </w:p>
+    <w:p>
+      <w:pPr>
+        <w:spacing w:line="336" w:lineRule="auto" w:after="0"/>
+        <w:ind w:firstLine="454"/>
+        <w:jc w:val="both"/>
+      </w:pPr>
+      <w:r>
+        <w:rPr>
+          <w:color w:val="1A1A1A"/>
+          <w:sz w:val="24"/>
+        </w:rPr>
+        <w:t>And on one steamy, love-drenched night, she fell pregnant. This was my third catastrophe.</w:t>
       </w:r>
     </w:p>
     <w:p>
@@ -819,7 +917,7 @@
           <w:color w:val="1A1A1A"/>
           <w:sz w:val="24"/>
         </w:rPr>
-        <w:t>So it's there, shall we say, within my psyche, that at some part of my life there was an abuse of my sexual powers, even though it was a very wonderful moment. Buddhism is no different from other religions. As soon as there's conception, there's consciousness. So there's a living being. There's no way out of that. That's what's understood, anyway.</w:t>
+        <w:t>So it's there, shall we say, within my psyche, that at some part of my life there was an abuse of my sexual powers, even though it was a very wonderful moment.</w:t>
       </w:r>
     </w:p>
     <w:p>
@@ -833,7 +931,7 @@
           <w:color w:val="1A1A1A"/>
           <w:sz w:val="24"/>
         </w:rPr>
-        <w:t>And this further, I think what this did to me was it further alienated me. It further alienated me from my own heart. It further put me into a position of what you might call an underlying despair, which I never really looked at. It was just there underneath. The boredom, the meaninglessness, and then this tragedy — all that just lay down upon me as a despair, which every occasion would actually lend me in an angry depression. But it never lasted long because I'm very sanguine.</w:t>
+        <w:t>Buddhism is no different from other religions. As soon as there's conception, there's consciousness. So there's a living being. There's no way out of that. That's what's understood, anyway.</w:t>
       </w:r>
     </w:p>
     <w:p>
@@ -847,7 +945,7 @@
           <w:color w:val="1A1A1A"/>
           <w:sz w:val="24"/>
         </w:rPr>
-        <w:t>And then one day... I was twenty-one, 1968, very important date, 1968. That was the student revolutions, if you remember, in Paris and all that. And I lay in bed on a Sunday and I said to myself, I wonder what will happen if I don't go to church.</w:t>
+        <w:t>And this, I think what this did to me was it further alienated me. It further alienated me from my own heart. It further put me into a position of what you might call an underlying despair, which I never really looked at. It was just there underneath. The boredom, the meaninglessness, and then this tragedy—all that just lay down upon me as a sort of despair, which every occasion would actually lend me in an angry depression. But it never lasted long because I'm very sanguine.</w:t>
       </w:r>
     </w:p>
     <w:p>
@@ -861,7 +959,7 @@
           <w:color w:val="1A1A1A"/>
           <w:sz w:val="24"/>
         </w:rPr>
-        <w:t>Now in those days, if you didn't go to church, it was a mortal sin. And if you didn't get to confess to a priest and you died, you went to hell forever. That was the teaching. So it was a big decision. They changed all that in the mid-sixties with Pope John XXIII.</w:t>
+        <w:t>And then one day... I was twenty-one, 1968—very important date, 1968. That was the student revolutions, if you remember, in Paris and all that. And I lay in bed on a Sunday and I said to myself, I wonder what will happen if I don't go to church.</w:t>
       </w:r>
     </w:p>
     <w:p>
@@ -875,7 +973,7 @@
           <w:color w:val="1A1A1A"/>
           <w:sz w:val="24"/>
         </w:rPr>
-        <w:t>And I said to myself, if I don't go to church today, let's see what happens. Nothing happened. So I never went again. I know, it's the most ridiculous thing to do. And what it manifests really was that the religion had now lost that connection of devotion. It had just become an empty ritual. I was just turning up for the mass, receiving communion, et cetera, et cetera. And it had lost its potency. I think also there might have been guilt about the abortion and all that. And so there was a cutoff there.</w:t>
+        <w:t>Now in those days, if you didn't go to church, it was a mortal sin. And if you didn't get to confess to a priest and you died, you went to hell forever. I mean, that was the teaching. So it was a big decision. They changed all that in the mid-sixties with Pope John XXIII.</w:t>
       </w:r>
     </w:p>
     <w:p>
@@ -889,7 +987,49 @@
           <w:color w:val="1A1A1A"/>
           <w:sz w:val="24"/>
         </w:rPr>
-        <w:t>Now, what this did, of course, was it deepened my alienation. It deepened my alienation to the whole thing. In other words, I found myself where Nietzsche found himself. I only discovered Nietzsche fairly recently — because God is dead. We've killed him. Nietzsche struggled with that. He came up with the answer of the courage to face the sufferings and the death of life and to somehow rise above it. And that's what he meant by the superman or supraman, the Übermensch.</w:t>
+        <w:t>And I said to myself, if I don't go to church today, let's see what happens. Nothing happened. So I never went again.</w:t>
+      </w:r>
+    </w:p>
+    <w:p>
+      <w:pPr>
+        <w:spacing w:line="336" w:lineRule="auto" w:after="0"/>
+        <w:ind w:firstLine="454"/>
+        <w:jc w:val="both"/>
+      </w:pPr>
+      <w:r>
+        <w:rPr>
+          <w:color w:val="1A1A1A"/>
+          <w:sz w:val="24"/>
+        </w:rPr>
+        <w:t>I know, it's the most ridiculous thing to do. And what it manifests really was that the religion had now lost that connection of devotion. It had just become an empty ritual. I was just turning up for the mass, receiving communion, et cetera, et cetera. And it had lost its potency. I think also there might have been guilt about the abortion and all that. And so there was a cutoff there.</w:t>
+      </w:r>
+    </w:p>
+    <w:p>
+      <w:pPr>
+        <w:spacing w:line="336" w:lineRule="auto" w:after="0"/>
+        <w:ind w:firstLine="454"/>
+        <w:jc w:val="both"/>
+      </w:pPr>
+      <w:r>
+        <w:rPr>
+          <w:color w:val="1A1A1A"/>
+          <w:sz w:val="24"/>
+        </w:rPr>
+        <w:t>Now, what this did, of course, was it deepened my alienation. It deepened my alienation to the whole thing. In other words, I found myself where Nietzsche found himself. I only discovered Nietzsche fairly recently—because God is dead. We've killed him.</w:t>
+      </w:r>
+    </w:p>
+    <w:p>
+      <w:pPr>
+        <w:spacing w:line="336" w:lineRule="auto" w:after="0"/>
+        <w:ind w:firstLine="454"/>
+        <w:jc w:val="both"/>
+      </w:pPr>
+      <w:r>
+        <w:rPr>
+          <w:color w:val="1A1A1A"/>
+          <w:sz w:val="24"/>
+        </w:rPr>
+        <w:t>Nietzsche struggled with that. He came up with the answer of a sort of courage to face the sufferings and the death of life and to somehow rise above it. And that's what he meant by the superman or supraman, the Übermensch.</w:t>
       </w:r>
     </w:p>
     <w:p>
@@ -917,7 +1057,7 @@
           <w:color w:val="1A1A1A"/>
           <w:sz w:val="24"/>
         </w:rPr>
-        <w:t>So we have to, I think, imagine the Buddha himself going through an existential crisis. And it's so strong within him to find the answer to this that he leaves his family. In his case, his just-born child. So I think from our point of view, this is where the Buddha's at. The meaningfulness of life is gone. It's an existential angst. And that's where I was, really, with this existential anxiety.</w:t>
+        <w:t>So we have to, I think, imagine the Buddha himself going through an existential crisis. And it's so strong within him to find the answer to this that he leaves his family. In his case, his just-born child.</w:t>
       </w:r>
     </w:p>
     <w:p>
@@ -931,7 +1071,21 @@
           <w:color w:val="1A1A1A"/>
           <w:sz w:val="24"/>
         </w:rPr>
-        <w:t>Now, I don't want to give you the impression that I was going around moping and all that. No, I was still getting drunk and having a good time. It's just that every so often in silent moments, just by yourself, you suddenly sink into this area of just sheer boredom, a despair about life. You're just living it.</w:t>
+        <w:t>So I think from our point of view, this is where the Buddha's at. The meaningfulness of life is gone. It's an existential angst. And that's where I was, really, with this existential anxiety.</w:t>
+      </w:r>
+    </w:p>
+    <w:p>
+      <w:pPr>
+        <w:spacing w:line="336" w:lineRule="auto" w:after="0"/>
+        <w:ind w:firstLine="454"/>
+        <w:jc w:val="both"/>
+      </w:pPr>
+      <w:r>
+        <w:rPr>
+          <w:color w:val="1A1A1A"/>
+          <w:sz w:val="24"/>
+        </w:rPr>
+        <w:t>Now, I don't want to give you the impression that I was going around moping and all that. No, I was still getting drunk and having a good time. It's just that every so often in silent moments, just by yourself, you suddenly sink into this area of sheer boredom, a sort of despair about life. You're just living it.</w:t>
       </w:r>
     </w:p>
     <w:p>
@@ -959,7 +1113,7 @@
           <w:color w:val="1A1A1A"/>
           <w:sz w:val="24"/>
         </w:rPr>
-        <w:t>And in the first act, two people come, walk across the stage. I won't go into too much detail. But in the second act, one's gone blind and the other one's gone dumb. And in the first act, there are leaves on the tree. In the second act, there are no leaves. So here are the two tramps waiting for Godot, and everything's just getting worse.</w:t>
+        <w:t>In the first act, two people come, walk across the stage. I won't go into too much detail. But in the second act, one's gone blind and the other one's gone dumb. And in the first act, there are leaves on the tree. In the second act, there are no leaves. So here are the two tramps waiting for Godot, and everything's just getting worse.</w:t>
       </w:r>
     </w:p>
     <w:p>
@@ -1015,7 +1169,7 @@
           <w:color w:val="1A1A1A"/>
           <w:sz w:val="24"/>
         </w:rPr>
-        <w:t>In terms of my emotional life, when I wasn't being extrovert and going out there, there's a lovely poem by Gerard Manley Hopkins that gets it across. I've carried this for a long time now. It gives you an idea — I think it's just a wonderful piece of poetry.</w:t>
+        <w:t>In terms of my emotional life, when I wasn't being extrovert and going out there, there was this—there's a lovely poem by Gerard Manley Hopkins that gets it across. And I carried this now for a long time. But it gives you an idea. I think it's just a wonderful piece of poetry.</w:t>
       </w:r>
     </w:p>
     <w:p>
@@ -1029,7 +1183,7 @@
           <w:color w:val="1A1A1A"/>
           <w:sz w:val="24"/>
         </w:rPr>
-        <w:t>I wake and feel the fell of dark, not day. What hours, what black hours we have spent this night! What sights, heart, you saw, ways you went, and more must in longer lights delay! With witness I speak this, but where I say hours, I mean years, I mean life. My lament is cries countless, cries like dead letters sent to dearest him, that lives, alas, away. I am gall, I am heartburn. God's most deep decree bitter would have me taste. My taste was me. Bones built in me, flesh filled, blood brimmed the curse. Self-yeast of spirit, a dull dough sours. I see the lost are like this, and their scourge to be as I am mine, their sweating selves, but worse.</w:t>
+        <w:t>I wake and feel the fell of dark, not day. / What hours, what black hours we have spent this night! / What sights, heart, you saw, ways you went, and more must in longer lights delay! / With witness I speak this, but where I say hours, I mean years, I mean life. / My lament is cries countless, cries like dead letters sent to dearest him, that lives, alas, away. / I am gall, I am heartburn. / God's most deep decree / Bitter would have me taste. / My taste was me. / Bones built in me, flesh filled, blood brimmed the curse. / Self-yeast of spirit, a dull dough sours. / I see the lost are like this, and their scourge to be as I am mine. / Their sweating selves, but worse.</w:t>
       </w:r>
     </w:p>
     <w:p>
@@ -1043,7 +1197,7 @@
           <w:color w:val="1A1A1A"/>
           <w:sz w:val="24"/>
         </w:rPr>
-        <w:t>Isn't that good, eh? Their sweating selves. I love it.</w:t>
+        <w:t>Ooh. Isn't that good, eh? Their sweating selves. I love it.</w:t>
       </w:r>
     </w:p>
     <w:p>
@@ -1057,7 +1211,7 @@
           <w:color w:val="1A1A1A"/>
           <w:sz w:val="24"/>
         </w:rPr>
-        <w:t>After that terrible birth, we seem to have both recovered. I hadn't seen this picture for years. And when I saw it, I thought, well, blow me down. Two things came to mind when I saw it. I thought, first of all, we remember our mothers as old, in old age. We forget they were all lovely young women.</w:t>
+        <w:t>After that terrible birth, we seem to have both recovered. I hadn't seen this picture for years. And when I saw it, I thought, well, blow me down. And two things came to mind when I saw it. I thought, first of all, we remember our mothers as old, in old age. We forget they were all lovely young women.</w:t>
       </w:r>
     </w:p>
     <w:p>
@@ -1071,7 +1225,7 @@
           <w:color w:val="1A1A1A"/>
           <w:sz w:val="24"/>
         </w:rPr>
-        <w:t>And the other thing was that little child — if it was just shown to me, there's no way I'd make a connection with that child at all. This is my tenth body, if we're to believe biology. Every ten years, you completely change all the atoms in your body.</w:t>
+        <w:t>And the other thing was that little child—if it was just shown to me, there's no way I'd make a connection with that child at all. This is the tenth body. There's no way I'd make a connection. This is my tenth body, if we're to believe biology. Every ten years, you completely change all the atoms in your body.</w:t>
       </w:r>
     </w:p>
     <w:p>
@@ -1085,7 +1239,7 @@
           <w:color w:val="1A1A1A"/>
           <w:sz w:val="24"/>
         </w:rPr>
-        <w:t>So the relationship breaks up. I can't handle it anymore. Anyway, I'm in Spain and I'm looking for my friends and I've lost them. I've arrived there sometime later. And I pick up a telegram from the local post office. Do you remember telegrams? Fantastic. And it said, "Congratulations, son, BA and teaching certificate."</w:t>
+        <w:t>So okay, I leave, the relationship breaks up. I can't handle it anymore. Anyway, I'm in Spain and I'm looking for my friends and I've lost them. I've arrived there sometime later. And I pick up a telegram from the local post office. Do you remember telegrams? Yeah, fantastic. You get it out through the telegram.</w:t>
       </w:r>
     </w:p>
     <w:p>
@@ -1099,7 +1253,7 @@
           <w:color w:val="1A1A1A"/>
           <w:sz w:val="24"/>
         </w:rPr>
-        <w:t>I went up onto a high rock and overlooked the sea. And I said to myself, there's no way in this world I want to teach.</w:t>
+        <w:t>And it said, congratulations, son, BA and teaching certificate. And I went up onto a high rock and overlooked the sea. And I said to myself, there's no way in this world I want to teach.</w:t>
       </w:r>
     </w:p>
     <w:p>
@@ -1113,7 +1267,7 @@
           <w:color w:val="1A1A1A"/>
           <w:sz w:val="24"/>
         </w:rPr>
-        <w:t>So I went down and camped in this camp. That night, there was torrential rain. I woke up with the tent around me, completely sodden with sand and everything, staggered to the drink area looking pretty miserable. And I met this bloke called Dave. We began talking. And by the end of the evening, we decided to travel together across the world. Simple as that.</w:t>
+        <w:t>So I went down and camped in this camp. And that night, there was a torrential rain. I woke up with the tent around me, completely sodden with sand and everything, staggered to the drink area, the, what do you call it? It's where people drink and stuff like that. And looking pretty miserable for myself.</w:t>
       </w:r>
     </w:p>
     <w:p>
@@ -1127,7 +1281,7 @@
           <w:color w:val="1A1A1A"/>
           <w:sz w:val="24"/>
         </w:rPr>
-        <w:t>So I came back, and I got a job through somebody I knew as a rep selling audiovisuals to schools. There was lots of money in education, so I made lots of money. I was travelling all over Cornwall and all over Wales selling this stuff to schools. And I gathered something like a thousand pounds, which must be a lot of money these days, isn't it? A thousand pounds.</w:t>
+        <w:t>And I met this bloke called Dave. And we began talking. And by the end of the evening, we decided to travel together across the world. Simple as that. See?</w:t>
       </w:r>
     </w:p>
     <w:p>
@@ -1141,7 +1295,7 @@
           <w:color w:val="1A1A1A"/>
           <w:sz w:val="24"/>
         </w:rPr>
-        <w:t>Come the year, off we went. And during that time, remember, all this time I've got this thing going on, this nothingness and this stuff in the heart. But because of the joy of travel, just the constant new information coming in and the liberty of it, it was all underneath. It would only come up in the gloomier moments.</w:t>
+        <w:t>So I came back, and I got a job through somebody I knew as a rep for selling audiovisuals to schools. And there was lots of money in education, so I made lots of money. And I was traveling all over Cornwall and all over Wales selling this stuff to schools. And I gathered something like a thousand pounds, which must be what? It's a lot of money these days, isn't it? A thousand pounds.</w:t>
       </w:r>
     </w:p>
     <w:p>
@@ -1155,7 +1309,7 @@
           <w:color w:val="1A1A1A"/>
           <w:sz w:val="24"/>
         </w:rPr>
-        <w:t>So we went off and started towards North Africa. We went down, saw all the stuff in Egypt, the usual stuff — ride a camel and all that. Went over to Khartoum, lay on the luggage rack to sleep and woke up with sand everywhere because of a sandstorm. Got onto a boat down to Juba, which is now the capital of South Sudan.</w:t>
+        <w:t>And come the year, off we went. And during that time, remember, all this time I've got this thing going on, this nothingness and this stuff in the heart. But because of the joy of travel, just the constant new information coming in and the libel of it, it was all sort of underneath. It would only come up in the gloomier moments.</w:t>
       </w:r>
     </w:p>
     <w:p>
@@ -1169,7 +1323,21 @@
           <w:color w:val="1A1A1A"/>
           <w:sz w:val="24"/>
         </w:rPr>
-        <w:t>For ten days, we were looking at the amazing sight of reeds. The reeds were so tall, they went up above the boat. And the boat just ploughed through this canal, which was the Nile. All you saw for ten days was reeds. And because we didn't have much money, we were just eating bread. So this was a really gloomy time. That's when I wrote most of my doggerel about nothingness.</w:t>
+        <w:t>So anyway, we went off and we started off towards North Africa. We went down to, saw all the stuff in Egypt, the usual stuff, you know, ride a camel and all that. Went over to Khartoum, lay on the luggage rack to sleep and woke up with sand everywhere because of a sandstorm.</w:t>
+      </w:r>
+    </w:p>
+    <w:p>
+      <w:pPr>
+        <w:spacing w:line="336" w:lineRule="auto" w:after="0"/>
+        <w:ind w:firstLine="454"/>
+        <w:jc w:val="both"/>
+      </w:pPr>
+      <w:r>
+        <w:rPr>
+          <w:color w:val="1A1A1A"/>
+          <w:sz w:val="24"/>
+        </w:rPr>
+        <w:t>Got onto a boat down to Juba, which is now the capital of South Sudan. And for 10 days, we were looking at the amazing site of reeds. The reeds were so tall, they went up above the boat. And the boat just plowed through this canal, which was the Nile. And all you saw for 10 days was reeds. And because we didn't have much money, we were just eating bread. So this was a really gloomy time. And that's when I wrote most of my doggerel about nothingness.</w:t>
       </w:r>
     </w:p>
     <w:p>
@@ -1197,7 +1365,7 @@
           <w:color w:val="1A1A1A"/>
           <w:sz w:val="24"/>
         </w:rPr>
-        <w:t>Got to Mombasa, stayed with his brother, but we didn't get on so well. So we went up the beach and camped up there. And there we got stolen from. All our traveller's cheques were stolen, which was fantastic because when you got to India, you got on the black market and made a lot of money. Terrible, isn't it?</w:t>
+        <w:t>Got to Mombasa, stayed with his brother, but we didn't get on so well. So we went up the beach and camped up there. And there we got stolen. All our traveling checks were stolen, which was fantastic because when you got to India, you got on the black market and made a lot of money. Terrible, isn't it?</w:t>
       </w:r>
     </w:p>
     <w:p>
@@ -1211,7 +1379,7 @@
           <w:color w:val="1A1A1A"/>
           <w:sz w:val="24"/>
         </w:rPr>
-        <w:t>And they stole my father's watch. He'd given me this gold watch that he had been given after he'd finished his time as a headmaster at St. Patrick's. It had an inscription on the back, and it was a precious thing. So I wrote him a letter expressing my sense of sorrow and my love of him and all that. Well, when his reply came back, about three or four months later — he said, "Thank you, son. Bit sentimental."</w:t>
+        <w:t>And they stole my father's watch. He'd given me this gold watch that he had been given after he'd finished his time as a headmaster at St. Patrick's. And it had inscribed on it at the back, and it was a precious thing, you know?</w:t>
       </w:r>
     </w:p>
     <w:p>
@@ -1225,7 +1393,7 @@
           <w:color w:val="1A1A1A"/>
           <w:sz w:val="24"/>
         </w:rPr>
-        <w:t>So we get this cattle boat across the Indian Ocean from Mombasa to Bombay, playing chess all the time. Lots of travellers, by the way. There weren't many going down Egypt. But by the time we got to Africa, the boat was full of Westerners. It was all hippies. I was dressed in purple.</w:t>
+        <w:t>So I wrote him a letter expressing my sense of sorrow and my love of him and all that, you see. Well, when his reply came back, you know, about three or four months later... He said, thank you, son. Bit sentimental.</w:t>
       </w:r>
     </w:p>
     <w:p>
@@ -1239,7 +1407,7 @@
           <w:color w:val="1A1A1A"/>
           <w:sz w:val="24"/>
         </w:rPr>
-        <w:t>So we take this boat all the way across to Bombay, and we do the usual trip. And we finally end up in Nepal. That's when we got really stoned. Up in Nepal, lots of these places full of dope. And there were these lovely hippie gatherings where we'd all sit in a circle with a chillum. That's ridiculous, isn't it? And that lasted for a while.</w:t>
+        <w:t>So we get to India. So we get this cattle boat across the Indian Sea from Mombasa to Bombay, playing chess all the time. Lots of travelers, by the way. There wasn't many going down Egypt. But by the time we got to Africa, the boat was full of Westerners. It was all hippies. I was dressed in purple.</w:t>
       </w:r>
     </w:p>
     <w:p>
@@ -1253,7 +1421,7 @@
           <w:color w:val="1A1A1A"/>
           <w:sz w:val="24"/>
         </w:rPr>
-        <w:t>And then we made our way down to Calcutta. Calcutta was at war. That was the Indo-Pakistan war where Bangladesh split off. There were no planes going out, so we were stuck there for two weeks.</w:t>
+        <w:t>So we take this boat all the way across to Bombay, and we do the usual trip. And we finally end up in Nepal. And that's when we got really stoned. Up in Nepal, lots of these stones full of dope. And there were these lovely hippie sort of gatherings where we'd all sit in a circle with a chillum. That's ridiculous, isn't it?</w:t>
       </w:r>
     </w:p>
     <w:p>
@@ -1267,7 +1435,7 @@
           <w:color w:val="1A1A1A"/>
           <w:sz w:val="24"/>
         </w:rPr>
-        <w:t>And what I did every day — this was one of my big awakenings. When you went to India this time, it wasn't so bad. But in those days, sickness, destitution was in your face. It was in your face.</w:t>
+        <w:t>And that lasted for a while. And then we made our way down to Calcutta.</w:t>
       </w:r>
     </w:p>
     <w:p>
@@ -1281,7 +1449,63 @@
           <w:color w:val="1A1A1A"/>
           <w:sz w:val="24"/>
         </w:rPr>
-        <w:t>In Calcutta, they have a huge park with this massive statue of Queen Victoria, which I presume they've got rid of now. And there was a massive road, a circuit road going around. That road was packed tight with the sick. Elephantiasis, everything apart from lepers, all the way around. They were lying on the pavement. When you saw that, you understood Mother Teresa's compassion, because many of them would have died just there. Anyway, I saw that. That sort of thing I'm not used to, I'm not ready to receive. I'm aware of the suffering, but I'm not ready to receive it.</w:t>
+        <w:t>And Calcutta was at war. That was the Indo-Pakistan war where Bangladesh split off. And so there was no planes going out. So we were stuck there for two weeks.</w:t>
+      </w:r>
+    </w:p>
+    <w:p>
+      <w:pPr>
+        <w:spacing w:line="336" w:lineRule="auto" w:after="0"/>
+        <w:ind w:firstLine="454"/>
+        <w:jc w:val="both"/>
+      </w:pPr>
+      <w:r>
+        <w:rPr>
+          <w:color w:val="1A1A1A"/>
+          <w:sz w:val="24"/>
+        </w:rPr>
+        <w:t>And what I did every day, so this was one of my big awakenings. When you went to India, this time it wasn't so bad. But in those days, sickness, destitution was in your face. It was in your face.</w:t>
+      </w:r>
+    </w:p>
+    <w:p>
+      <w:pPr>
+        <w:spacing w:line="336" w:lineRule="auto" w:after="0"/>
+        <w:ind w:firstLine="454"/>
+        <w:jc w:val="both"/>
+      </w:pPr>
+      <w:r>
+        <w:rPr>
+          <w:color w:val="1A1A1A"/>
+          <w:sz w:val="24"/>
+        </w:rPr>
+        <w:t>And in Calcutta, they have a huge park with this massive statue of Queen Victoria, which I presume they got rid of now. And there was a massive road, a circuit road going around. That road was packed tight with the sick. Elephantitis, everything, apart from lepers, all the way around. And they were lying on the pavement. And when you saw that, you understood Mother Teresa's compassion. Because many of them would have died just there.</w:t>
+      </w:r>
+    </w:p>
+    <w:p>
+      <w:pPr>
+        <w:spacing w:line="336" w:lineRule="auto" w:after="0"/>
+        <w:ind w:firstLine="454"/>
+        <w:jc w:val="both"/>
+      </w:pPr>
+      <w:r>
+        <w:rPr>
+          <w:color w:val="1A1A1A"/>
+          <w:sz w:val="24"/>
+        </w:rPr>
+        <w:t>So anyway, I saw that. That sort of thing I'm not used to, I'm not ready to receive. I'm aware of the suffering, but I'm not ready to receive it.</w:t>
+      </w:r>
+    </w:p>
+    <w:p>
+      <w:pPr>
+        <w:spacing w:line="336" w:lineRule="auto" w:after="0"/>
+        <w:ind w:firstLine="454"/>
+        <w:jc w:val="both"/>
+      </w:pPr>
+      <w:r>
+        <w:rPr>
+          <w:color w:val="1A1A1A"/>
+          <w:sz w:val="24"/>
+        </w:rPr>
+        <w:t>Every day I went to this Sikh restaurant to get curry, and I would always ask for a glass of water. When they brought the glass of water, which was a pint glass, you'd always see a nice oily thumbprint on the side. I don't know how it was that I was in India for so long and never caught anything. It's just weird.</w:t>
       </w:r>
     </w:p>
     <w:p>
@@ -1309,7 +1533,7 @@
           <w:color w:val="1A1A1A"/>
           <w:sz w:val="24"/>
         </w:rPr>
-        <w:t>Then I'm coming round the corner, just wandering around Calcutta, and I come round the corner, and right before me there's this little girl. She must be over seven, but she looks round about five. And she's sucking a dried black banana peel. She sees me, and as she sees me, she has the dignity in that destitution to cover her sex.</w:t>
+        <w:t>So then I'm coming round the corner, just wandering around Calcutta, and I come round the corner, and right before me, there's this little girl. She must be over seven, but she looks round about five. And she's sucking a dried black banana peel. She sees me, and as she sees me, she has the dignity in that destitution to cover her sex.</w:t>
       </w:r>
     </w:p>
     <w:p>
@@ -1323,7 +1547,7 @@
           <w:color w:val="1A1A1A"/>
           <w:sz w:val="24"/>
         </w:rPr>
-        <w:t>That hit me so hard that I just bombed past her. I never went back to buy her a banana. It just hit me so hard. That was my little boy drowned on the beach moment. Where suddenly the awareness of compassion is not enough. There has to be that contact.</w:t>
+        <w:t>That hit me so hard that I just bombed past her. I never went back to buy her a banana. It just hit me so hard.</w:t>
       </w:r>
     </w:p>
     <w:p>
@@ -1337,7 +1561,21 @@
           <w:color w:val="1A1A1A"/>
           <w:sz w:val="24"/>
         </w:rPr>
-        <w:t>Anyway, that passed. And that stays with me. Every time I bring that image to mind, if I feel callous about anything — about refugees and all these sort of people — I just bring that little child to mind. And that's my connection with all the suffering that's going on these days.</w:t>
+        <w:t>That was my little boy drowned on the beach moment. Where suddenly, the awareness of compassion is not enough. There has to be that contact.</w:t>
+      </w:r>
+    </w:p>
+    <w:p>
+      <w:pPr>
+        <w:spacing w:line="336" w:lineRule="auto" w:after="0"/>
+        <w:ind w:firstLine="454"/>
+        <w:jc w:val="both"/>
+      </w:pPr>
+      <w:r>
+        <w:rPr>
+          <w:color w:val="1A1A1A"/>
+          <w:sz w:val="24"/>
+        </w:rPr>
+        <w:t>Anyway, that passed. And that stays with me. Every time I bring that image to mind, if I feel callous about anything — about refugees and all these people — I just bring that little child to mind. And that's my connection with all the suffering that's going on these days.</w:t>
       </w:r>
     </w:p>
     <w:p>
@@ -1379,7 +1617,7 @@
           <w:color w:val="1A1A1A"/>
           <w:sz w:val="24"/>
         </w:rPr>
-        <w:t>Before long, we're off on a flight. We're going to Bangkok, and we do the usual tourist trip, wandering into all these beautiful Buddhist buildings. That's it. I have no connection at all with Buddhism. For me, they're just museums. And again, a bit of naughty stuff and cocaine and all that in Bangkok. None of it really held.</w:t>
+        <w:t>So before long, we're off on a flight. We're going to Bangkok, and we do the usual tourist trip, wandering into all these beautiful Buddhist buildings. That's it. I have no connection at all with Buddhism. For me, they're just museums.</w:t>
       </w:r>
     </w:p>
     <w:p>
@@ -1393,7 +1631,7 @@
           <w:color w:val="1A1A1A"/>
           <w:sz w:val="24"/>
         </w:rPr>
-        <w:t>It was only years later when I read that book, Emotional Intelligence by Goleman, which brought this whole thing about emotional intelligence into consciousness — he says in it, if you're a depressive, you tend to be drawn to those sorts of drugs that lift you out of your depression. These are not hallucinatory drugs. And if you are an anxious person, you're drawn to alcohol. Well, that's me, isn't it?</w:t>
+        <w:t>It was only years later when I read that book, Emotional Intelligence by Goleman, which brought this whole thing about emotional intelligence into consciousness, that he says in it, if you're a depressive, you tend to be drawn to those sorts of drugs that lift you out of your depression. These are not hallucinatory drugs. And if you are an anxious person, you're drawn to alcohol. Well, that's me, isn't it?</w:t>
       </w:r>
     </w:p>
     <w:p>
@@ -1407,7 +1645,7 @@
           <w:color w:val="1A1A1A"/>
           <w:sz w:val="24"/>
         </w:rPr>
-        <w:t>We left Bangkok, went down through Malaysia, and then we had to walk across the bridge to Singapore. As we got to the checkpoint, they sent us back to get a haircut. So we had to cut my hair off, all of it, and then come back. Then we took this boat, which was a real proper lovely little boat, all the way to Port Moresby. It was on its way to Cairns and down to Australia. And that was New Guinea.</w:t>
+        <w:t>So we left Bangkok, went down through Malaysia, and then we had to walk across the bridge to Singapore. As we got to the checkpoint, they sent us back to get a haircut. So we had to cut my hair off, all of it, and then come back. Then we took this boat, which was a real proper lovely little boat, all the way to Port Moresby. It was on its way to Cairns and down to Australia. And that was New Guinea.</w:t>
       </w:r>
     </w:p>
     <w:p>
@@ -1449,7 +1687,7 @@
           <w:color w:val="1A1A1A"/>
           <w:sz w:val="24"/>
         </w:rPr>
-        <w:t>It was during that time that, because I was settled — and as soon as I was settled, I've got this dreadful thing going on, this nothingness. I go back from teaching, I don't know what it was, I lie on the bed and I'm suddenly suffused with this enormous fear.</w:t>
+        <w:t>It was during that time that, because I was settled — and as soon as I was settled, I've got this dreadful thing going on, this nothingness.</w:t>
       </w:r>
     </w:p>
     <w:p>
@@ -1463,7 +1701,7 @@
           <w:color w:val="1A1A1A"/>
           <w:sz w:val="24"/>
         </w:rPr>
-        <w:t>And for something — I don't know, I must have got it from somewhere — I turn towards the fear, and I go into it, and next minute I'm out of my body. I'm up there looking down. I turn round, I see that tunnel, swirling tunnel, and I'm back into the body. All fear of death disappeared. Not the fear of dying — all fear of death disappeared. And suddenly, out of the blue, I start writing plays. I start writing plays.</w:t>
+        <w:t>I go back from teaching, I don't know what it was, I lie on the bed and I'm suddenly suffused with this enormous fear. And for something — I don't know, I must have got it from somewhere — I turn towards the fear, and I go into it, and next minute, I'm out of my body. I'm up there looking down, I turn round, I see that tunnel, swirling tunnel, and I'm back into the body.</w:t>
       </w:r>
     </w:p>
     <w:p>
@@ -1477,7 +1715,7 @@
           <w:color w:val="1A1A1A"/>
           <w:sz w:val="24"/>
         </w:rPr>
-        <w:t>I go down to Australia because I'm interested in theatre, and I go to a training school really to learn the art of theatre because I know virtually nothing about it. And that's where I fall in love again. Hijacked.</w:t>
+        <w:t>All fear of death disappeared. Not the fear of dying — all fear of death disappeared. And suddenly, out of the blue, I start writing plays. I start writing plays.</w:t>
       </w:r>
     </w:p>
     <w:p>
@@ -1491,7 +1729,7 @@
           <w:color w:val="1A1A1A"/>
           <w:sz w:val="24"/>
         </w:rPr>
-        <w:t>We have a lovely relationship. It's going fine. We're involved in theatre. I get one or two plays going. And suddenly this idea of marriage comes up. My brother just got married. I was twenty-seven. And that's what you do.</w:t>
+        <w:t>I go down to Australia because I'm interested in theatre and I go to a training school really to learn the art of theatre because I know virtually nothing about it. And that's where I fall in love again. Hijacked.</w:t>
       </w:r>
     </w:p>
     <w:p>
@@ -1505,7 +1743,7 @@
           <w:color w:val="1A1A1A"/>
           <w:sz w:val="24"/>
         </w:rPr>
-        <w:t>But in my heart of hearts, I wasn't with it at all. I wasn't with it at all. But because of the relationship and because of the love and all that, you get married. And so we went through a civil service. And there was something in me that just couldn't handle this. And I was getting, you know, I was sort of overly happy. And I remember my dear best man, as we got into the taxi, said to me, you know, Pete, that's what it's called, you know, Pete, you've got to take something seriously.</w:t>
+        <w:t>So we have a lovely relationship. It's going fine. We're involved in theatre. I get one or two plays going. And suddenly this idea of marriage comes up. My brother just got married. I was 27. And that's what you do.</w:t>
       </w:r>
     </w:p>
     <w:p>
@@ -1519,7 +1757,7 @@
           <w:color w:val="1A1A1A"/>
           <w:sz w:val="24"/>
         </w:rPr>
-        <w:t>Well, it was a disaster because somebody who had been a friend, a companion, a lover, somebody whom I shared theatre with, suddenly became a burden. I'd fallen into the patriarchal trap. She became a burden. And we went on a honeymoon and I sort of drained it of joy. And she said to me at one point, you know, if you carry on like this, I'll leave you. That's not the sort of conversation you have on a honeymoon, is it? It's absolutely awful.</w:t>
+        <w:t>But in my heart of hearts, I wasn't with it at all. I wasn't with it at all. But because of the relationship and because of the love and all that, you get married. And so we went through a civil service.</w:t>
       </w:r>
     </w:p>
     <w:p>
@@ -1533,7 +1771,7 @@
           <w:color w:val="1A1A1A"/>
           <w:sz w:val="24"/>
         </w:rPr>
-        <w:t>We got to London, and my brother offered us lodgings, and hitting London in November from... It was the beginning of summer in Australia, and the rain and the cold, and then we hit the theatre, and it was just overwhelming. I mean, Sydney was a small city, you know, a little small city with a major theatre and a couple of little outlets. You hit London, and it's just impossible.</w:t>
+        <w:t>And there was something in me that just couldn't handle this. I was getting overly happy. And I remember my dear best man, as we got into the taxi, said to me, "Pete" — that's what I was called — "Pete, you've got to take something seriously."</w:t>
       </w:r>
     </w:p>
     <w:p>
@@ -1547,7 +1785,7 @@
           <w:color w:val="1A1A1A"/>
           <w:sz w:val="24"/>
         </w:rPr>
-        <w:t>I sent my plays off, and I would follow them up, and I got one play back, and it had 600 written on it. I mean, it was just overwhelming. I was so depressed, and we were so depressed. I was dragging her down. I was dragging her down, too.</w:t>
+        <w:t>Well, it was a disaster because somebody who had been a friend, a companion, a lover, somebody whom I shared theatre with, suddenly became a burden. I'd fallen into the patriarchal trap. She became a burden.</w:t>
       </w:r>
     </w:p>
     <w:p>
@@ -1561,7 +1799,7 @@
           <w:color w:val="1A1A1A"/>
           <w:sz w:val="24"/>
         </w:rPr>
-        <w:t>We were at the SOAS, School of Oriental and Asian Studies. And while we were there, this Nigerian approached us and he said he was taking a troop out to Nigeria and would we be interested. Well, we were completely lost. We just said yes.</w:t>
+        <w:t>And we went on a honeymoon and I drained it of joy. And she said to me at one point, "If you carry on like this, I'll leave you." That's not the sort of conversation you have on a honeymoon, is it? It's absolutely awful.</w:t>
       </w:r>
     </w:p>
     <w:p>
@@ -1575,7 +1813,7 @@
           <w:color w:val="1A1A1A"/>
           <w:sz w:val="24"/>
         </w:rPr>
-        <w:t>And he went and gave us lodgings. He said, I'm going to get the group together in a house. So he actually, I left my brother, went to this house, and it was just an empty room with a mattress in it. We had to put a line up for the clothes. And I'm standing there for about two, three weeks, and nothing's happening. And we're saying, Larry, what's, you know, can you show us the play?</w:t>
+        <w:t>We got to London, and my brother offered us lodgings. Hitting London in November from — it was the beginning of summer in Australia — the rain and the cold, and then we hit the theatre, and it was just overwhelming. Sydney was a small city with a major theatre and a couple of little outlets. You hit London, and it's just impossible.</w:t>
       </w:r>
     </w:p>
     <w:p>
@@ -1589,7 +1827,7 @@
           <w:color w:val="1A1A1A"/>
           <w:sz w:val="24"/>
         </w:rPr>
-        <w:t>And finally he shows us this play, and it could have been written by a 10-year-old. And it was an inverted racist play. It was all about this great black chief who was going to teach these stupid white people something. And myself and Chris, by the way, who was, her mother was Aboriginal and her father was English, we just looked at each other, got to get out of this, got to get out of this.</w:t>
+        <w:t>I sent my plays off, and I would follow them up, and I got one play back, and it had "600" written on it. It was just overwhelming. I was so depressed, and we were so depressed. I was dragging her down too.</w:t>
       </w:r>
     </w:p>
     <w:p>
@@ -1603,7 +1841,7 @@
           <w:color w:val="1A1A1A"/>
           <w:sz w:val="24"/>
         </w:rPr>
-        <w:t>Very fortunately, I'd lost contact with Dave, my travelling companion. And as we got onto a tube, he was right there. I said, Dave, see? Just as a wonderful thing. He was moving out of a flat in Highgate. We were down in Kentish Town. And it just worked for us.</w:t>
+        <w:t>We were at SOAS, the School of Oriental and African Studies. And while we were there, this Nigerian approached us and said he was taking a troupe out to Nigeria and would we be interested. Well, we were completely lost. We just said yes.</w:t>
       </w:r>
     </w:p>
     <w:p>
@@ -1617,7 +1855,7 @@
           <w:color w:val="1A1A1A"/>
           <w:sz w:val="24"/>
         </w:rPr>
-        <w:t>So the night before, we'd planned the escape because there must have been something in us that told us something like this would happen. We told him that we weren't going to come. That evening he came round and he went ballistic. I mean, it was racist. It was awful. And my wife stepped forward and slapped his face. He made for her. I grabbed hold of him. I'm on the floor with him. I'm holding him down. I'm shouting, relax, Harry, let go. I go, finally when he gives up, when he gives up the struggle, we both get up and he's standing there and he goes off again. I said, yeah, you know, and I'm very penitent and I'm saying this, get back. And finally he left.</w:t>
+        <w:t>And he gave us lodgings. He said, "I'm going to get the group together in a house." So I left my brother's, went to this house, and it was just an empty room with a mattress in it. We had to put a line up for the clothes. And I'm standing there for about two, three weeks, and nothing's happening. And we're saying, "Larry, can you show us the play? Can you show us the play?"</w:t>
       </w:r>
     </w:p>
     <w:p>
@@ -1631,7 +1869,7 @@
           <w:color w:val="1A1A1A"/>
           <w:sz w:val="24"/>
         </w:rPr>
-        <w:t>That night, we slept with doors up against the, with chairs up against the doors and a carving knife. I slept with a carving knife. It's the case, it's everyday. Seven o'clock in the morning, we're in that taxi and off we went.</w:t>
+        <w:t>And finally he shows us this play, and it could have been written by a ten-year-old. And it was an inverted racist play. It was all about this great black chief who was going to teach these stupid white people something. And myself and Chris — by the way, her mother was Aboriginal and her father was English — we just looked at each other: got to get out of this, got to get out of this.</w:t>
       </w:r>
     </w:p>
     <w:p>
@@ -1645,7 +1883,7 @@
           <w:color w:val="1A1A1A"/>
           <w:sz w:val="24"/>
         </w:rPr>
-        <w:t>Anyway, it just got worse. It just got worse and worse and worse. And eventually, my wife got a job in a theatre company up in Birmingham. And really, that was the first leaving. We both knew something was wrong. We knew it wasn't working. And her leaving really was the beginning of that, of her leaving me.</w:t>
+        <w:t>Very fortunately, I'd lost contact with Dave, my travelling companion. And as we got onto a tube, he was right there. I said, "Dave!" See? Just a wonderful thing. He was moving out of a flat in Highgate. We were down in Kentish Town. And it just worked for us.</w:t>
       </w:r>
     </w:p>
     <w:p>
@@ -1659,7 +1897,7 @@
           <w:color w:val="1A1A1A"/>
           <w:sz w:val="24"/>
         </w:rPr>
-        <w:t>I went back home really depressed. I was back in teaching FE. It was awful. I was getting nowhere with my plays. There was a fantastic opportunity when the director of Earl's Court Theatre actually asked me to come along. I had an interview with him. And we were discussing this play I'd read. I mean, you don't do that with a top director. And I didn't have the energy to go back with another play. I didn't keep the contact. I mean, that's what you do. Once you've got your foot in, you keep pushing.</w:t>
+        <w:t>So the night before, we'd planned the escape because there must have been something in us that told us something like this would happen. We told him that we weren't going to come. That evening he came round and he went ballistic. It was racist. It was awful. And my wife stepped forward and slapped his face. He made for her. I grabbed hold of him. I'm on the floor with him. I'm holding him down. I'm shouting, "Relax, Larry, let go." Finally, when he gives up the struggle, we both get up and he's standing there and he goes off again. And I'm very penitent and I'm saying, "Get back." And finally he left.</w:t>
       </w:r>
     </w:p>
     <w:p>
@@ -1673,7 +1911,7 @@
           <w:color w:val="1A1A1A"/>
           <w:sz w:val="24"/>
         </w:rPr>
-        <w:t>And so I'm getting slowly, slowly depressed, like a play. And that's when Chris tells me that she's fallen in love with somebody else.</w:t>
+        <w:t>That night, we slept with chairs up against the doors and a carving knife. I slept with a carving knife. It's the case, it's everyday.</w:t>
       </w:r>
     </w:p>
     <w:p>
@@ -1687,7 +1925,7 @@
           <w:color w:val="1A1A1A"/>
           <w:sz w:val="24"/>
         </w:rPr>
-        <w:t>So apart from the ego thump, the affection had sort of almost disappeared, really. So there wasn't that sense of loss that you might get from somebody whom you truly love. But it put a cap on my situation. I mean, I was getting nowhere, plays were no good, I was teaching, which I hated doing, I was going nowhere. So I was in a state of absolute despair. And I was in a state of shock and despair.</w:t>
+        <w:t>Seven o'clock in the morning, we're in that taxi and off we went. Anyway, it just got worse. It just got worse and worse and worse. And eventually, my wife got a job in a theatre company up in Birmingham. And really, that was the first leaving. We both knew something was wrong. We knew it wasn't working. And her leaving really was the beginning of that — of her leaving me.</w:t>
       </w:r>
     </w:p>
     <w:p>
@@ -1701,7 +1939,63 @@
           <w:color w:val="1A1A1A"/>
           <w:sz w:val="24"/>
         </w:rPr>
-        <w:t>I thought, well, you know, everything I've built up these last years has been absolutely, it's just collapsed. And then it came to me that it was the most rational thing to do, the most obvious thing to do. In fact, it was common sense. I had to go to Japan to meditate.</w:t>
+        <w:t>I went back home really depressed. I was back in teaching FE. It was awful. I was getting nowhere with my plays. There was a fantastic opportunity when the director of Earl's Court Theatre actually asked me to come along. I had an interview with him. And we were discussing this play I'd written. You don't do that with a top director. And I didn't have the energy to go back with another play. I didn't keep the contact. That's what you do. Once you've got your foot in, you keep pushing.</w:t>
+      </w:r>
+    </w:p>
+    <w:p>
+      <w:pPr>
+        <w:spacing w:line="336" w:lineRule="auto" w:after="0"/>
+        <w:ind w:firstLine="454"/>
+        <w:jc w:val="both"/>
+      </w:pPr>
+      <w:r>
+        <w:rPr>
+          <w:color w:val="1A1A1A"/>
+          <w:sz w:val="24"/>
+        </w:rPr>
+        <w:t>And so I'm getting slowly, slowly depressed, like a play.</w:t>
+      </w:r>
+    </w:p>
+    <w:p>
+      <w:pPr>
+        <w:spacing w:line="336" w:lineRule="auto" w:after="0"/>
+        <w:ind w:firstLine="454"/>
+        <w:jc w:val="both"/>
+      </w:pPr>
+      <w:r>
+        <w:rPr>
+          <w:color w:val="1A1A1A"/>
+          <w:sz w:val="24"/>
+        </w:rPr>
+        <w:t>And that's when Chris tells me that she's fallen in love with somebody else. So apart from the ego thump, the affection had almost disappeared, really. So there wasn't that sense of loss that you might get from somebody whom you truly love.</w:t>
+      </w:r>
+    </w:p>
+    <w:p>
+      <w:pPr>
+        <w:spacing w:line="336" w:lineRule="auto" w:after="0"/>
+        <w:ind w:firstLine="454"/>
+        <w:jc w:val="both"/>
+      </w:pPr>
+      <w:r>
+        <w:rPr>
+          <w:color w:val="1A1A1A"/>
+          <w:sz w:val="24"/>
+        </w:rPr>
+        <w:t>But it put a cap on my situation. I was getting nowhere, plays were no good, I was teaching, which I hated doing, I was going nowhere. So I was in a state of absolute despair. I was in a state of shock and despair. I thought, well, everything I've built up these last years has just collapsed.</w:t>
+      </w:r>
+    </w:p>
+    <w:p>
+      <w:pPr>
+        <w:spacing w:line="336" w:lineRule="auto" w:after="0"/>
+        <w:ind w:firstLine="454"/>
+        <w:jc w:val="both"/>
+      </w:pPr>
+      <w:r>
+        <w:rPr>
+          <w:color w:val="1A1A1A"/>
+          <w:sz w:val="24"/>
+        </w:rPr>
+        <w:t>And then it came to me that it was the most rational thing to do, the most obvious thing to do. In fact, it was common sense. I had to go to Japan to meditate.</w:t>
       </w:r>
     </w:p>
     <w:p>
@@ -1729,7 +2023,7 @@
           <w:color w:val="1A1A1A"/>
           <w:sz w:val="24"/>
         </w:rPr>
-        <w:t>So I wrote to the Buddhist Society. How do we find places before Google? It's a mystery, isn't it? Anyway, I wrote to them, and they wrote back and gave me 21 reasons as to why I shouldn't go to Japan. But they put me in touch with Throssel Hole Abbey that had only recently opened up in Hexham in Northumberland. And from them, they put me in touch with Vajra Bailey, who was teaching in Birmingham, just a bus ride away from where I was living.</w:t>
+        <w:t>So I wrote to the Buddhist Society. How do we find places before Google? It's a mystery, isn't it? Anyway, I wrote to them, and they wrote back and gave me twenty-one reasons as to why I shouldn't go to Japan. But they put me in touch with Throssel Hole Abbey that had only recently opened up in Hexham in Northumberland. And from them, they put me in touch with Vajra Bailey, who was teaching in Birmingham, just a bus ride away from where I was living.</w:t>
       </w:r>
     </w:p>
     <w:p>
@@ -1743,7 +2037,7 @@
           <w:color w:val="1A1A1A"/>
           <w:sz w:val="24"/>
         </w:rPr>
-        <w:t>So I remember going there on a cold February day, and she was very zen, you know. And the house was cold. And we got up to the room, and there was a couple of Greek people there. And then she took us into the shrine room. We all bowed, and I thought, this is ridiculous.</w:t>
+        <w:t>I remember going there on a cold February day, and she was very Zen. The house was cold. We got up to the room, and there were a couple of Greek people there. Then she took us into the shrine room. We all bowed, and I thought, this is ridiculous.</w:t>
       </w:r>
     </w:p>
     <w:p>
@@ -1757,7 +2051,21 @@
           <w:color w:val="1A1A1A"/>
           <w:sz w:val="24"/>
         </w:rPr>
-        <w:t>Then she sat me on a stool, pushed my back in, and sat me upright. She said, just watch. Keep your eyes open like that. The instruction was: watch what comes up. So I sat there for forty minutes in absolute agony, both emotionally and physically. But by the end of it, I was just convinced this was going to get me out of this hole.</w:t>
+        <w:t>Then she sat me on a stool, and she pushed my back in and sat me upright. She said, just watch. Keep your eyes open like that. And the instruction was: watch what comes up.</w:t>
+      </w:r>
+    </w:p>
+    <w:p>
+      <w:pPr>
+        <w:spacing w:line="336" w:lineRule="auto" w:after="0"/>
+        <w:ind w:firstLine="454"/>
+        <w:jc w:val="both"/>
+      </w:pPr>
+      <w:r>
+        <w:rPr>
+          <w:color w:val="1A1A1A"/>
+          <w:sz w:val="24"/>
+        </w:rPr>
+        <w:t>I sat there for forty minutes in absolute agony, both emotionally and physically. But by the end of it, I was just convinced this was going to get me out of this hole.</w:t>
       </w:r>
     </w:p>
     <w:p>
@@ -1785,7 +2093,7 @@
           <w:color w:val="1A1A1A"/>
           <w:sz w:val="24"/>
         </w:rPr>
-        <w:t>So I carried on doing that. Then I went up to Zen, and being part of a Zen monastery was like being back in St Richard's. It just came to me with such ease. I loved going up there, even during the summer holidays. I'd spend six weeks up at Throssel Abbey.</w:t>
+        <w:t>I carried on doing that. Then I went up to Zen, and being part of a Zen monastery was like being back in St Richard's. It just came to me with such ease. I loved going up there, even during the summer holidays. I'd spend six weeks up at Throssel Abbey.</w:t>
       </w:r>
     </w:p>
     <w:p>
@@ -1799,7 +2107,7 @@
           <w:color w:val="1A1A1A"/>
           <w:sz w:val="24"/>
         </w:rPr>
-        <w:t>Then one day I came back, lay on the bed, and this tremendous fear just filled the whole of my body, every cell — I felt it everywhere. And there came this picture of this little boy, two years old, going into the front room, shaking my grandfather and saying, he's dead, they've killed him, now they're going to kill me. Two years old.</w:t>
+        <w:t>Then one day I came back, and I lay on the bed, and this tremendous fear just filled the whole of my body, every cell—I felt it everywhere. And there came this picture of this little boy, two years old, going into the front room, shaking my grandfather and saying, he's dead, they've killed him, now they're going to kill me. Two years old.</w:t>
       </w:r>
     </w:p>
     <w:p>
@@ -1813,7 +2121,7 @@
           <w:color w:val="1A1A1A"/>
           <w:sz w:val="24"/>
         </w:rPr>
-        <w:t>So I said to my father, I found grandfather dead in the front room. He said, no, he died in bed, I was with him. This tells a lot about trauma, children's trauma. Obviously my parents weren't getting on — they didn't. Anyway, I'm thinking I'm the problem. They go in and they presume they've killed my dear old grandfather, and I presume they're going to kill me now.</w:t>
+        <w:t>I said to my father, I found grandfather dead in the front room. He said, no, he died in bed, I was with him.</w:t>
       </w:r>
     </w:p>
     <w:p>
@@ -1827,7 +2135,21 @@
           <w:color w:val="1A1A1A"/>
           <w:sz w:val="24"/>
         </w:rPr>
-        <w:t>What happened when that trauma came up — you have to be very careful with childhood memories, right? Because you don't know what you're laying on them actually in the memory. I speak to myself in English, but I don't think I had English — in fact I could barely speak at the age of two. But that was the thought.</w:t>
+        <w:t>This tells a lot about trauma, children's trauma. Obviously my parents weren't getting on—they didn't. Anyway, I'm thinking I'm the problem. They go in and they presume they've killed the old man, my dear old grandfather. And I presume they're going to kill me now.</w:t>
+      </w:r>
+    </w:p>
+    <w:p>
+      <w:pPr>
+        <w:spacing w:line="336" w:lineRule="auto" w:after="0"/>
+        <w:ind w:firstLine="454"/>
+        <w:jc w:val="both"/>
+      </w:pPr>
+      <w:r>
+        <w:rPr>
+          <w:color w:val="1A1A1A"/>
+          <w:sz w:val="24"/>
+        </w:rPr>
+        <w:t>You have to be very careful with childhood memories, because you don't know what you're laying on them actually in the memory. I speak to myself in English, but I don't think I had English—in fact I could barely speak at the age of two. But that was the thought.</w:t>
       </w:r>
     </w:p>
     <w:p>
@@ -1855,7 +2177,7 @@
           <w:color w:val="1A1A1A"/>
           <w:sz w:val="24"/>
         </w:rPr>
-        <w:t>Shortly after that — a little bit longer after that — I mean, that was such a wonderful relief — and then shortly after that, I'm walking along the road, and on the other side there's a copse of wood. As I turn into the copse of wood, I get this thump on the head. This energy comes down into the heart, it shoots out towards this tree, and what I'm looking at is a kaleidoscopic vortex of energy reaching up into the sky.</w:t>
+        <w:t>Shortly after that, a little bit longer after that—I mean, that was such a wonderful relief—and then shortly after that, I'm walking along the road, and on the other side there's a copse of wood. As I turn into the copse of wood, I get this thump on the head. This energy comes down into the heart, it shoots out towards this tree, and what I'm looking at is a kaleidoscopic vortex of energy reaching up into the sky.</w:t>
       </w:r>
     </w:p>
     <w:p>
@@ -1869,7 +2191,7 @@
           <w:color w:val="1A1A1A"/>
           <w:sz w:val="24"/>
         </w:rPr>
-        <w:t>For a while I was blissed out, and I remember particularly looking at this crimson geometry of a rose. That lasted for an hour or two, and then I got depressed and anxious again.</w:t>
+        <w:t>For a while I was blissed out, and I remember particularly looking at the crimson geometry of a rose. That lasted for an hour or two, and then I got depressed and anxious again.</w:t>
       </w:r>
     </w:p>
     <w:p>
@@ -1883,7 +2205,7 @@
           <w:color w:val="1A1A1A"/>
           <w:sz w:val="24"/>
         </w:rPr>
-        <w:t>Now if you were to ask me if I had a choice between those two — what would I have gone for? This sort of vision or this purification of the heart? No choice. You go for the purification of the heart. Because that's something you can do. You can't make these other things happen. And they seem to come to cap a certain level. They don't come to begin something. They seem to end a process. So I don't think that sort of insight or vision or whatever it was would have been possible without the clearing of the heart.</w:t>
+        <w:t>Now if you were to ask me if I had a choice between those two—what would I have gone for? This sort of vision or this purification of the heart? No choice. You go for the purification of the heart. Because that's something you can do. You can't make these other things happen. And they seem to come to cap a certain level. They don't come to begin something. They seem to end a process.</w:t>
       </w:r>
     </w:p>
     <w:p>
@@ -1897,7 +2219,7 @@
           <w:color w:val="1A1A1A"/>
           <w:sz w:val="24"/>
         </w:rPr>
-        <w:t>Now if you look at the Dhammapada, the Buddha puts the practice as: Stop doing evil, do good, purify the heart. This is the teaching of all the Buddhas. It's as simple as that. So this purifying of the heart, what we go through when we're sitting there with all these gunk coming up — that is something we can actually do something directly about.</w:t>
+        <w:t>I don't think that would have been possible, that sort of insight or vision or whatever it was. It wouldn't have been possible without the clearing of the heart.</w:t>
       </w:r>
     </w:p>
     <w:p>
@@ -1911,7 +2233,7 @@
           <w:color w:val="1A1A1A"/>
           <w:sz w:val="24"/>
         </w:rPr>
-        <w:t>Now when it comes to this other thing, this bump on the head — what do you think? God? Big being? Or just neurons firing through your head, just atomic, subatomic activity firing through the head? The thing is, I don't know. It didn't feel like a personal God. It just felt as though I was given this gift, and I've remained at that level.</w:t>
+        <w:t>Now if you look at the Dhammapada, the Buddha puts the practice as: stop doing evil, do good, purify the heart. This is the teaching of all the Buddhas. It's as simple as that.</w:t>
       </w:r>
     </w:p>
     <w:p>
@@ -1925,7 +2247,7 @@
           <w:color w:val="1A1A1A"/>
           <w:sz w:val="24"/>
         </w:rPr>
-        <w:t>So if something happens like that to you, you don't have to expand it into some huge cosmology. It's just something that you receive. It's just an interesting thing. And what I understood by that was that the whole of this phenomenal world is nothing but light. It's nothing but energy. And matter is just the coagulation of it. That's all it is. That's what it's made of. There's nothing real. There's nothing substantial in it.</w:t>
+        <w:t>This purifying of the heart, what we go through when we're sitting there with all these things coming up—that is something we can actually do something directly about.</w:t>
       </w:r>
     </w:p>
     <w:p>
@@ -1939,7 +2261,7 @@
           <w:color w:val="1A1A1A"/>
           <w:sz w:val="24"/>
         </w:rPr>
-        <w:t>The story then is basically how I became a Buddhist. I went up to Throssel, I joined the Zen monastery. And then through that, through Vajra Bailey, I met a Theravada monk and I did a retreat with him. In that retreat I was drawn. Then the next year the Mahasi teachers came, and that gave me a real technique in which to really delve into myself in a way that Zen hadn't really done.</w:t>
+        <w:t>Now when it comes to this other thing, this bump on the head, what do you think? God? A big being? Or just neurons firing through your head, just atomic, subatomic activity firing through the head.</w:t>
       </w:r>
     </w:p>
     <w:p>
@@ -1953,7 +2275,7 @@
           <w:color w:val="1A1A1A"/>
           <w:sz w:val="24"/>
         </w:rPr>
-        <w:t>It was from that that I decided to take a sabbatical from work, and I went to Burma with my teacher for six months. When I came back — during that time, this whole business of impermanence became even clearer, because there I actually clearly saw that although what I'd seen about this tree might be true out there, what's actually true in here is the arising and passing away, minutely, of consciousnesses.</w:t>
+        <w:t>The thing is, I don't know. It didn't feel like a personal God. It just felt as though I was given this gift, and I've remained at that level. If something happens like that to you, you don't have to expand it into some huge cosmology. It's just something that you receive. It's just an interesting thing.</w:t>
       </w:r>
     </w:p>
     <w:p>
@@ -1967,7 +2289,7 @@
           <w:color w:val="1A1A1A"/>
           <w:sz w:val="24"/>
         </w:rPr>
-        <w:t>That's actually what we're experiencing all the time, just this screen which is flashing, flashing inside us. And what is it that's aware of it? What is it that is looking at it? That, of course, is our satipaññā, our intuitive awareness. And it's that separation which is the process of liberating ourselves from the delusion of thinking that we are this psychophysical organism.</w:t>
+        <w:t>And what I understood by that was that the whole of this phenomenal world is nothing but light. It's nothing but energy. And that matter is just the coagulation of it. That's all it is. That's what it's made of. There's nothing real. There's nothing substantial in it.</w:t>
       </w:r>
     </w:p>
     <w:p>
@@ -1981,7 +2303,7 @@
           <w:color w:val="1A1A1A"/>
           <w:sz w:val="24"/>
         </w:rPr>
-        <w:t>So when I got back, I was really fired up. I was going to make a go of it. I got back to the college I was teaching at, and they gave me a promotion for my MSA. Can you believe that? So I thought, this is what I've got to do. I'll take a sabbatical every so often. I'll come back and get a promotion. They gave me a promotion.</w:t>
+        <w:t>Anyway, all that passed, and I carried on teaching. The story then is basically how I became a Buddhist. I went up to Throssel, I joined the Zen monastery. And then through that, through Vajra Bailey, I met the Theravāda monk and I did a retreat with him. And in that retreat I was drawn.</w:t>
       </w:r>
     </w:p>
     <w:p>
@@ -1995,7 +2317,7 @@
           <w:color w:val="1A1A1A"/>
           <w:sz w:val="24"/>
         </w:rPr>
-        <w:t>During that time, I was ready really to move into the whole thing of marriage. I bought a new house. It was a semi-detached house. And during that time, I began to fall in love again. Oh, my goodness. So there was then this real potential, you see.</w:t>
+        <w:t>Then the next year the Mahāsī teachers came, and that gave me a real technique in which to really delve into myself in a way that Zen hadn't really done. And it was from that that I decided to take a sabbatical from work, and I went to Burma with my teacher for six months.</w:t>
       </w:r>
     </w:p>
     <w:p>
@@ -2009,7 +2331,7 @@
           <w:color w:val="1A1A1A"/>
           <w:sz w:val="24"/>
         </w:rPr>
-        <w:t>But something else started to creep in: why don't I spend three years as a monk? The monastic order was established by the Buddha exactly for that reason. When you look at the rules of the monastic order, you end up simply learning the Dhamma or meditating. There's nothing beyond that if you're keeping the rule as he would want it. And the whole infrastructure that comes with it in a society holds you there, holds you in that place.</w:t>
+        <w:t>When I came back, during that time, this whole business of impermanence became even clearer because there I actually clearly saw that although what I'd seen about this tree might be true out there, what's actually true in here is the arising and passing away, minutely, of consciousnesses. And that's actually what we're experiencing all the time—just this screen which is flashing, flashing inside us.</w:t>
       </w:r>
     </w:p>
     <w:p>
@@ -2023,7 +2345,7 @@
           <w:color w:val="1A1A1A"/>
           <w:sz w:val="24"/>
         </w:rPr>
-        <w:t>I struggled with that for about a year, making lists for and against, and for and against. And finally, when it really got on top of me, I went to see Raywaddhana, my teacher, and I said, "Bhante, I want to become a monk." And he said, "You're too old." What a relief. Let's get back and live properly. So that was it.</w:t>
+        <w:t>And what is it that's aware of it? What is it that is looking at it? And that, of course, is our satipaññā, our intuitive awareness. And it's that separation which is the process of liberating ourselves from the delusion of thinking that we are this psychophysical organism.</w:t>
       </w:r>
     </w:p>
     <w:p>
@@ -2037,7 +2359,7 @@
           <w:color w:val="1A1A1A"/>
           <w:sz w:val="24"/>
         </w:rPr>
-        <w:t>But it wouldn't leave me. Come another six months, I'm back to him and I'm saying, "Listen, I've got to—I really have to ordain. Even if it's only for three years." That was my intention, a three-year ordination. Again, he said, "No, you're needed here." I'd become now so much part of that vihara. And there were only a few of us. He wasn't the type of person who collected people, so there were only about three of us who held the whole vihara up.</w:t>
+        <w:t>When I got back, I was really fired up. I was going to make a go of it. I got back to the college I was teaching at, and they gave me a promotion for my MSc. Can you believe that? I thought, this is what I've got to do. I'll take a sabbatical every so often, come back and get a promotion. They gave me a promotion.</w:t>
       </w:r>
     </w:p>
     <w:p>
@@ -2051,7 +2373,7 @@
           <w:color w:val="1A1A1A"/>
           <w:sz w:val="24"/>
         </w:rPr>
-        <w:t>Again, I went away, but this time I wasn't so convinced. I spent two weeks in meditation with a good friend who read Lord of the Rings while I was suffering in the other room. If you're listening, Peter, you'll remember. And I came back absolutely determined. When I went to see him again, he said, "OK."</w:t>
+        <w:t>And then during that time, I was ready really to move into the whole thing of marriage. I bought a new house. It was a semi-detached house. And during that time, I began to fall in love again. Oh, my goodness. And so there was then this real potential, you see.</w:t>
       </w:r>
     </w:p>
     <w:p>
@@ -2065,7 +2387,7 @@
           <w:color w:val="1A1A1A"/>
           <w:sz w:val="24"/>
         </w:rPr>
-        <w:t>So I ordained for three years. And I remember telling my mother. She burst into this enormous wail of tears. I put my arm around her. I said, "Mum, it's only for three years." And she stopped. In Catholicism, if you're a monk, you disappear. These days they're not so strict, but you disappear into the monastery; you don't see him again.</w:t>
+        <w:t>But something else started to creep in, which was: why don't I spend three years as a monk?</w:t>
       </w:r>
     </w:p>
     <w:p>
@@ -2079,7 +2401,7 @@
           <w:color w:val="1A1A1A"/>
           <w:sz w:val="24"/>
         </w:rPr>
-        <w:t>There was a lovely feast for that ordination. And I went off to work with Goenkaji in his centre in Igatpuri, India. There, something came out of my neck, some snake or other—it was absolutely awful. And I came back feeling I'd got rid of some big thing.</w:t>
+        <w:t>Now, the monastic order was established by the Buddha exactly for that reason. When you look at the rules of the monastic order, you end up simply learning the Dhamma or meditating. There's nothing beyond that if you're keeping the rule as he would want it. And the whole infrastructure that comes with it in a society is that it holds you there, it holds you in that place.</w:t>
       </w:r>
     </w:p>
     <w:p>
@@ -2093,7 +2415,7 @@
           <w:color w:val="1A1A1A"/>
           <w:sz w:val="24"/>
         </w:rPr>
-        <w:t>And who should be there at the vihara but Sayadaw U Pandita—some of you might know him. He's one of the prime teachers of the Mahasi tradition, and he invited me to come and join him in Burma. Before I did that, I thought, why don't I go and live at Amaravati, the big monastery there, and really get to know what it is to live in this community.</w:t>
+        <w:t>I struggled with that for about a year, making lists for and against, and for and against.</w:t>
       </w:r>
     </w:p>
     <w:p>
@@ -2107,7 +2429,973 @@
           <w:color w:val="1A1A1A"/>
           <w:sz w:val="24"/>
         </w:rPr>
-        <w:t>So I turned up there, and it was during that year that there were those demonstrations in Burma and all the killing and everything that they did. It was the one before the one...</w:t>
+        <w:t>And finally, when it really got on top of me, I went to see Rewata Dhamma, my teacher, and I said, "Bhante, I want to become a monk." And he said, "You're too old." What a relief. Let's get back and live properly.</w:t>
+      </w:r>
+    </w:p>
+    <w:p>
+      <w:pPr>
+        <w:spacing w:line="336" w:lineRule="auto" w:after="0"/>
+        <w:ind w:firstLine="454"/>
+        <w:jc w:val="both"/>
+      </w:pPr>
+      <w:r>
+        <w:rPr>
+          <w:color w:val="1A1A1A"/>
+          <w:sz w:val="24"/>
+        </w:rPr>
+        <w:t>So that was it. But it wouldn't leave me. Come another six months, I'm back to him and I'm saying, "Listen, I've got to—I really have to ordain. Even if it's only for three years." That was my intention, a three-year ordination.</w:t>
+      </w:r>
+    </w:p>
+    <w:p>
+      <w:pPr>
+        <w:spacing w:line="336" w:lineRule="auto" w:after="0"/>
+        <w:ind w:firstLine="454"/>
+        <w:jc w:val="both"/>
+      </w:pPr>
+      <w:r>
+        <w:rPr>
+          <w:color w:val="1A1A1A"/>
+          <w:sz w:val="24"/>
+        </w:rPr>
+        <w:t>Again, he said, "No, you're needed here." I'd become now so much part of that vihāra. And there were only a few of us. He wasn't the type of person who collected people, so there were only about three of us who held the whole vihāra up.</w:t>
+      </w:r>
+    </w:p>
+    <w:p>
+      <w:pPr>
+        <w:spacing w:line="336" w:lineRule="auto" w:after="0"/>
+        <w:ind w:firstLine="454"/>
+        <w:jc w:val="both"/>
+      </w:pPr>
+      <w:r>
+        <w:rPr>
+          <w:color w:val="1A1A1A"/>
+          <w:sz w:val="24"/>
+        </w:rPr>
+        <w:t>Again, I went away, but this time I wasn't so convinced. I spent two weeks in meditation with a good friend who read Lord of the Rings while I was suffering in the other room. If you're listening, Peter, you'll remember. And I came back absolutely determined. And when I went to see him again, he said, "OK."</w:t>
+      </w:r>
+    </w:p>
+    <w:p>
+      <w:pPr>
+        <w:spacing w:line="336" w:lineRule="auto" w:after="0"/>
+        <w:ind w:firstLine="454"/>
+        <w:jc w:val="both"/>
+      </w:pPr>
+      <w:r>
+        <w:rPr>
+          <w:color w:val="1A1A1A"/>
+          <w:sz w:val="24"/>
+        </w:rPr>
+        <w:t>So I ordained for three years. And I remember telling my mother. She burst into this enormous veil of tears. I put my arm around her and said, "Mum, it's only for three years." And she stopped. In Catholicism, if you're a monk, you disappear. These days they're not so strict, but you disappear into the monastery; you don't see him again.</w:t>
+      </w:r>
+    </w:p>
+    <w:p>
+      <w:pPr>
+        <w:spacing w:line="336" w:lineRule="auto" w:after="0"/>
+        <w:ind w:firstLine="454"/>
+        <w:jc w:val="both"/>
+      </w:pPr>
+      <w:r>
+        <w:rPr>
+          <w:color w:val="1A1A1A"/>
+          <w:sz w:val="24"/>
+        </w:rPr>
+        <w:t>There was a lovely feast for that ordination. And I went off to work with Goenkaji in his centre in Igatpuri, India. And there, something came out of my neck—some snake or other—it was absolutely awful. And I came back feeling I'd got rid of some big thing.</w:t>
+      </w:r>
+    </w:p>
+    <w:p>
+      <w:pPr>
+        <w:spacing w:line="336" w:lineRule="auto" w:after="0"/>
+        <w:ind w:firstLine="454"/>
+        <w:jc w:val="both"/>
+      </w:pPr>
+      <w:r>
+        <w:rPr>
+          <w:color w:val="1A1A1A"/>
+          <w:sz w:val="24"/>
+        </w:rPr>
+        <w:t>And who should be there at the Vihara but Sayadaw U Pandita—some of you might know him. He's one of the prime teachers of the Mahasi tradition, and he invited me to come and join him in Burma.</w:t>
+      </w:r>
+    </w:p>
+    <w:p>
+      <w:pPr>
+        <w:spacing w:line="336" w:lineRule="auto" w:after="0"/>
+        <w:ind w:firstLine="454"/>
+        <w:jc w:val="both"/>
+      </w:pPr>
+      <w:r>
+        <w:rPr>
+          <w:color w:val="1A1A1A"/>
+          <w:sz w:val="24"/>
+        </w:rPr>
+        <w:t>Before I did that, I thought, why don't I go and live at Amaravati, the big monastery there, and really get to know what it is to live in this community. So I turned up there, and it was during that year that there were those demonstrations in Burma and all the killing and everything that they did. It was the one before the one that finally made the military pull back. So I decided not to go.</w:t>
+      </w:r>
+    </w:p>
+    <w:p>
+      <w:pPr>
+        <w:spacing w:line="336" w:lineRule="auto" w:after="0"/>
+        <w:ind w:firstLine="454"/>
+        <w:jc w:val="both"/>
+      </w:pPr>
+      <w:r>
+        <w:rPr>
+          <w:color w:val="1A1A1A"/>
+          <w:sz w:val="24"/>
+        </w:rPr>
+        <w:t>Then at the turning of the year, I said to the sangha, I said to the monks, listen, I ought to go and tell Sayadaw U Pandita why I've not turned up. So I went to his retreat at IMS—that's the Barre, Massachusetts place.</w:t>
+      </w:r>
+    </w:p>
+    <w:p>
+      <w:pPr>
+        <w:spacing w:line="336" w:lineRule="auto" w:after="0"/>
+        <w:ind w:firstLine="454"/>
+        <w:jc w:val="both"/>
+      </w:pPr>
+      <w:r>
+        <w:rPr>
+          <w:color w:val="1A1A1A"/>
+          <w:sz w:val="24"/>
+        </w:rPr>
+        <w:t>As soon as I walked into the meditation hall, I just knew this was it. I didn't want to live in that sort of forest community type of monasticism. I wanted this hard grind, full-on, full metal jacket meditation.</w:t>
+      </w:r>
+    </w:p>
+    <w:p>
+      <w:pPr>
+        <w:spacing w:line="336" w:lineRule="auto" w:after="0"/>
+        <w:ind w:firstLine="454"/>
+        <w:jc w:val="both"/>
+      </w:pPr>
+      <w:r>
+        <w:rPr>
+          <w:color w:val="1A1A1A"/>
+          <w:sz w:val="24"/>
+        </w:rPr>
+        <w:t>So I decided to go to Burma. But I couldn't get in. I got to Bangkok. I couldn't get a visa. I ended up in a monastery in the north. I finally caught up with U Pandita down in Penang, and I did a retreat with him there.</w:t>
+      </w:r>
+    </w:p>
+    <w:p>
+      <w:pPr>
+        <w:spacing w:line="336" w:lineRule="auto" w:after="0"/>
+        <w:ind w:firstLine="454"/>
+        <w:jc w:val="both"/>
+      </w:pPr>
+      <w:r>
+        <w:rPr>
+          <w:color w:val="1A1A1A"/>
+          <w:sz w:val="24"/>
+        </w:rPr>
+        <w:t>By this time, I'm despairing again. Because it's four years. I'm not getting anywhere. I'd determined three years. I thought, I'll give it another year.</w:t>
+      </w:r>
+    </w:p>
+    <w:p>
+      <w:pPr>
+        <w:spacing w:line="336" w:lineRule="auto" w:after="0"/>
+        <w:ind w:firstLine="454"/>
+        <w:jc w:val="both"/>
+      </w:pPr>
+      <w:r>
+        <w:rPr>
+          <w:color w:val="1A1A1A"/>
+          <w:sz w:val="24"/>
+        </w:rPr>
+        <w:t>So I'm kneeling in front of the Buddha statue. And I'm saying, look, I've done what I can. I said, if nothing happens in another year, I'm going to go back and do something useful.</w:t>
+      </w:r>
+    </w:p>
+    <w:p>
+      <w:pPr>
+        <w:spacing w:line="336" w:lineRule="auto" w:after="0"/>
+        <w:ind w:firstLine="454"/>
+        <w:jc w:val="both"/>
+      </w:pPr>
+      <w:r>
+        <w:rPr>
+          <w:color w:val="1A1A1A"/>
+          <w:sz w:val="24"/>
+        </w:rPr>
+        <w:t>There was a German monk there whom I was talking to, giving him all my sorrows and telling him where I was and all that. And he said to me, why don't you go to Sri Lanka? I said, Sri Lanka? I'd never even thought of the place. He was out there.</w:t>
+      </w:r>
+    </w:p>
+    <w:p>
+      <w:pPr>
+        <w:spacing w:line="336" w:lineRule="auto" w:after="0"/>
+        <w:ind w:firstLine="454"/>
+        <w:jc w:val="both"/>
+      </w:pPr>
+      <w:r>
+        <w:rPr>
+          <w:color w:val="1A1A1A"/>
+          <w:sz w:val="24"/>
+        </w:rPr>
+        <w:t>So I wrote to Venerable Pemasiri, who was the abbot. And he wrote back and said, come. When I got there, I told him what I wanted. I said, I just want to sit. I just want to find somewhere I can sit.</w:t>
+      </w:r>
+    </w:p>
+    <w:p>
+      <w:pPr>
+        <w:spacing w:line="336" w:lineRule="auto" w:after="0"/>
+        <w:ind w:firstLine="454"/>
+        <w:jc w:val="both"/>
+      </w:pPr>
+      <w:r>
+        <w:rPr>
+          <w:color w:val="1A1A1A"/>
+          <w:sz w:val="24"/>
+        </w:rPr>
+        <w:t>So he gave me these keys and directed me to this kuti, this hut at the back of the monastery. And when I got there, there's this beautiful little ten-foot by six-foot hut with a little caṅkama, a walking area with walls—to keep the snakes out and all that—and a garden all to myself. I walked in there and thought, this is absolutely marvellous.</w:t>
+      </w:r>
+    </w:p>
+    <w:p>
+      <w:pPr>
+        <w:spacing w:line="336" w:lineRule="auto" w:after="0"/>
+        <w:ind w:firstLine="454"/>
+        <w:jc w:val="both"/>
+      </w:pPr>
+      <w:r>
+        <w:rPr>
+          <w:color w:val="1A1A1A"/>
+          <w:sz w:val="24"/>
+        </w:rPr>
+        <w:t>So I had a toilet built—that was important. And then there came that day, which is very rare, even in the monastic life, where you didn't have to go into a retreat with the idea that you're going to finish in a month, three months, four months. I went in with no ending date.</w:t>
+      </w:r>
+    </w:p>
+    <w:p>
+      <w:pPr>
+        <w:spacing w:line="336" w:lineRule="auto" w:after="0"/>
+        <w:ind w:firstLine="454"/>
+        <w:jc w:val="both"/>
+      </w:pPr>
+      <w:r>
+        <w:rPr>
+          <w:color w:val="1A1A1A"/>
+          <w:sz w:val="24"/>
+        </w:rPr>
+        <w:t>And so I sat there going through all this purification of the heart, doing the meditation, two o'clock till ten o'clock at night, really going for it. I was absolutely empowered for doing it.</w:t>
+      </w:r>
+    </w:p>
+    <w:p>
+      <w:pPr>
+        <w:spacing w:line="336" w:lineRule="auto" w:after="0"/>
+        <w:ind w:firstLine="454"/>
+        <w:jc w:val="both"/>
+      </w:pPr>
+      <w:r>
+        <w:rPr>
+          <w:color w:val="1A1A1A"/>
+          <w:sz w:val="24"/>
+        </w:rPr>
+        <w:t>It was during that time my second trauma appeared out of the blue. I had this dream of looking across a pond and there was a ghost waving at me. Now this ghost was exactly what you expect a ghost to be—a big sheet with two eyes. And it was on the other side of the pond. I was absolutely terrified. I asked a Jungian psychologist about this. He said it was a birth trauma. I don't know.</w:t>
+      </w:r>
+    </w:p>
+    <w:p>
+      <w:pPr>
+        <w:spacing w:line="336" w:lineRule="auto" w:after="0"/>
+        <w:ind w:firstLine="454"/>
+        <w:jc w:val="both"/>
+      </w:pPr>
+      <w:r>
+        <w:rPr>
+          <w:color w:val="1A1A1A"/>
+          <w:sz w:val="24"/>
+        </w:rPr>
+        <w:t>Then one night, the dream came once, it came twice, this nightmare. And then one night I woke up and there it was in the corner of the room. I remember bouncing on the bed in absolute terror and my little voice saying, what do you want? What do you want? And the thing just disappeared. It just fizzled out. And that was it. Something just came out of the heart, this trauma. I still don't know what it means.</w:t>
+      </w:r>
+    </w:p>
+    <w:p>
+      <w:pPr>
+        <w:spacing w:line="336" w:lineRule="auto" w:after="0"/>
+        <w:ind w:firstLine="454"/>
+        <w:jc w:val="both"/>
+      </w:pPr>
+      <w:r>
+        <w:rPr>
+          <w:color w:val="1A1A1A"/>
+          <w:sz w:val="24"/>
+        </w:rPr>
+        <w:t>After that, the clarity of impermanence became even more obvious to me. And it was so fortunate. Death doesn't particularly regard you. Death happens when it wants to. It's usually most inconvenient.</w:t>
+      </w:r>
+    </w:p>
+    <w:p>
+      <w:pPr>
+        <w:spacing w:line="336" w:lineRule="auto" w:after="0"/>
+        <w:ind w:firstLine="454"/>
+        <w:jc w:val="both"/>
+      </w:pPr>
+      <w:r>
+        <w:rPr>
+          <w:color w:val="1A1A1A"/>
+          <w:sz w:val="24"/>
+        </w:rPr>
+        <w:t>At that point, just when everything was finished, my father died. I remember receiving the news and walking back towards the kuti. I'm crying. But I didn't cry long because when I reflected on his life, he had a good life. He was a happy man. He was very sanguine. And I loved him much.</w:t>
+      </w:r>
+    </w:p>
+    <w:p>
+      <w:pPr>
+        <w:spacing w:line="336" w:lineRule="auto" w:after="0"/>
+        <w:ind w:firstLine="454"/>
+        <w:jc w:val="both"/>
+      </w:pPr>
+      <w:r>
+        <w:rPr>
+          <w:color w:val="1A1A1A"/>
+          <w:sz w:val="24"/>
+        </w:rPr>
+        <w:t>I went back for his funeral. And then I thought, somebody has to stay with my mother, comfort my mother. So I stayed with my mother for a year and I was a real Job's comforter. I think I caused her more misery. Death stirs things up. I mean, if there's one woman I love to bitch about, it's my mother. And I could strangle her.</w:t>
+      </w:r>
+    </w:p>
+    <w:p>
+      <w:pPr>
+        <w:spacing w:line="336" w:lineRule="auto" w:after="0"/>
+        <w:ind w:firstLine="454"/>
+        <w:jc w:val="both"/>
+      </w:pPr>
+      <w:r>
+        <w:rPr>
+          <w:color w:val="1A1A1A"/>
+          <w:sz w:val="24"/>
+        </w:rPr>
+        <w:t>So I stayed with her for one year and then I came back and I said to the family, I don't think she's going to live long because she doesn't have the moral support.</w:t>
+      </w:r>
+    </w:p>
+    <w:p>
+      <w:pPr>
+        <w:spacing w:line="336" w:lineRule="auto" w:after="0"/>
+        <w:ind w:firstLine="454"/>
+        <w:jc w:val="both"/>
+      </w:pPr>
+      <w:r>
+        <w:rPr>
+          <w:color w:val="1A1A1A"/>
+          <w:sz w:val="24"/>
+        </w:rPr>
+        <w:t>Anyway, what happened was I went back with the fierce intention again to start, and off I went. It wasn't very long before she went seriously ill. So I came back, and I felt really bad about that year of comforting. This time I really made an effort.</w:t>
+      </w:r>
+    </w:p>
+    <w:p>
+      <w:pPr>
+        <w:spacing w:line="336" w:lineRule="auto" w:after="0"/>
+        <w:ind w:firstLine="454"/>
+        <w:jc w:val="both"/>
+      </w:pPr>
+      <w:r>
+        <w:rPr>
+          <w:color w:val="1A1A1A"/>
+          <w:sz w:val="24"/>
+        </w:rPr>
+        <w:t>You couldn't live with my mother. It was impossible. So we got her into a lovely nursing home. At first she hated it. She talked about le carrozze, these wheelchairs. She couldn't stand the wheelchairs. But when I went to see her after about a month, she was perfectly at home. She was back in boarding school. She was with all these friends, all these women. She was chatting away. She was the life of the party. It was absolutely wonderful to see her.</w:t>
+      </w:r>
+    </w:p>
+    <w:p>
+      <w:pPr>
+        <w:spacing w:line="336" w:lineRule="auto" w:after="0"/>
+        <w:ind w:firstLine="454"/>
+        <w:jc w:val="both"/>
+      </w:pPr>
+      <w:r>
+        <w:rPr>
+          <w:color w:val="1A1A1A"/>
+          <w:sz w:val="24"/>
+        </w:rPr>
+        <w:t>Anyway, again, most convenient, she decided to have a stroke just before I was off to Sri Lanka. She died within three days. So having buried her, I went back to Sri Lanka and started the process again.</w:t>
+      </w:r>
+    </w:p>
+    <w:p>
+      <w:pPr>
+        <w:spacing w:line="336" w:lineRule="auto" w:after="0"/>
+        <w:ind w:firstLine="454"/>
+        <w:jc w:val="both"/>
+      </w:pPr>
+      <w:r>
+        <w:rPr>
+          <w:color w:val="1A1A1A"/>
+          <w:sz w:val="24"/>
+        </w:rPr>
+        <w:t>The death of my mother was really weird. I felt like an orphan. I was, what, forty-five years old? And I felt like an orphan. I wrote this big, long letter to one of my cousins in Italy explaining how awful I felt. I don't know what he's done with it.</w:t>
+      </w:r>
+    </w:p>
+    <w:p>
+      <w:pPr>
+        <w:spacing w:line="336" w:lineRule="auto" w:after="0"/>
+        <w:ind w:firstLine="454"/>
+        <w:jc w:val="both"/>
+      </w:pPr>
+      <w:r>
+        <w:rPr>
+          <w:color w:val="1A1A1A"/>
+          <w:sz w:val="24"/>
+        </w:rPr>
+        <w:t>That passed. And then I went back and really went for it again.</w:t>
+      </w:r>
+    </w:p>
+    <w:p>
+      <w:pPr>
+        <w:spacing w:line="336" w:lineRule="auto" w:after="0"/>
+        <w:ind w:firstLine="454"/>
+        <w:jc w:val="both"/>
+      </w:pPr>
+      <w:r>
+        <w:rPr>
+          <w:color w:val="1A1A1A"/>
+          <w:sz w:val="24"/>
+        </w:rPr>
+        <w:t>There came this point where it was just impossible. The restlessness, the pain that was coming out of me, it was just constant. Day in. I woke up into it. I carried it through the day. I slept into it. I woke up and it just went on day after day. It got to a point when I thought, no, I just can't go on. I can't go on. I'm going to stop.</w:t>
+      </w:r>
+    </w:p>
+    <w:p>
+      <w:pPr>
+        <w:spacing w:line="336" w:lineRule="auto" w:after="0"/>
+        <w:ind w:firstLine="454"/>
+        <w:jc w:val="both"/>
+      </w:pPr>
+      <w:r>
+        <w:rPr>
+          <w:color w:val="1A1A1A"/>
+          <w:sz w:val="24"/>
+        </w:rPr>
+        <w:t>I can't tell you what happened then. When I gave up at that moment, there came into me this enormous terror, which picked me up and threw me back onto the meditation cushion.</w:t>
+      </w:r>
+    </w:p>
+    <w:p>
+      <w:pPr>
+        <w:spacing w:line="336" w:lineRule="auto" w:after="0"/>
+        <w:ind w:firstLine="454"/>
+        <w:jc w:val="both"/>
+      </w:pPr>
+      <w:r>
+        <w:rPr>
+          <w:color w:val="1A1A1A"/>
+          <w:sz w:val="24"/>
+        </w:rPr>
+        <w:t>Because that's the last thing you do. You can stop for a while, you can leave it, you can get drunk, you can do anything, but you never give up. Once you're on the path, you move on the path. If you give up, there's only one way to go. You're going to go down.</w:t>
+      </w:r>
+    </w:p>
+    <w:p>
+      <w:pPr>
+        <w:spacing w:line="336" w:lineRule="auto" w:after="0"/>
+        <w:ind w:firstLine="454"/>
+        <w:jc w:val="both"/>
+      </w:pPr>
+      <w:r>
+        <w:rPr>
+          <w:color w:val="1A1A1A"/>
+          <w:sz w:val="24"/>
+        </w:rPr>
+        <w:t>I was horrified. I can't tell you the horror that struck me when I realised that I'd actually given up on my spiritual journey. So I got over that pretty quickly. I just sat on the cushion and mowed my way through it.</w:t>
+      </w:r>
+    </w:p>
+    <w:p>
+      <w:pPr>
+        <w:spacing w:line="336" w:lineRule="auto" w:after="0"/>
+        <w:ind w:firstLine="454"/>
+        <w:jc w:val="both"/>
+      </w:pPr>
+      <w:r>
+        <w:rPr>
+          <w:color w:val="1A1A1A"/>
+          <w:sz w:val="24"/>
+        </w:rPr>
+        <w:t>By then my body was beginning to suffer, I think. I don't know, I was beginning to feel weak. I wasn't strong. I wrote to a monk I knew in London, who was Dr Vajrayana, with the intention of staying there just to get my body right.</w:t>
+      </w:r>
+    </w:p>
+    <w:p>
+      <w:pPr>
+        <w:spacing w:line="336" w:lineRule="auto" w:after="0"/>
+        <w:ind w:firstLine="454"/>
+        <w:jc w:val="both"/>
+      </w:pPr>
+      <w:r>
+        <w:rPr>
+          <w:color w:val="1A1A1A"/>
+          <w:sz w:val="24"/>
+        </w:rPr>
+        <w:t>So I turned up at the London Buddhist Vihara. I had this back room, and I was basically meditating. Then the monk who was teaching there decided to leave the order and get married. So who did they ask to sit on the podium? Me.</w:t>
+      </w:r>
+    </w:p>
+    <w:p>
+      <w:pPr>
+        <w:spacing w:line="336" w:lineRule="auto" w:after="0"/>
+        <w:ind w:firstLine="454"/>
+        <w:jc w:val="both"/>
+      </w:pPr>
+      <w:r>
+        <w:rPr>
+          <w:color w:val="1A1A1A"/>
+          <w:sz w:val="24"/>
+        </w:rPr>
+        <w:t>So I'm sitting there, and I'm slowly coming to understand that whatever took me to Sri Lanka—that energy, that inspiration—was dying away. I didn't want to go back there. How would I live in Britain? The only way you can live in Britain, if you want to find somewhere spiritually supportive, was to begin to teach. I needed support. So that's where the teaching began. But of course I had this horror of teaching. I really didn't want to do it.</w:t>
+      </w:r>
+    </w:p>
+    <w:p>
+      <w:pPr>
+        <w:spacing w:line="336" w:lineRule="auto" w:after="0"/>
+        <w:ind w:firstLine="454"/>
+        <w:jc w:val="both"/>
+      </w:pPr>
+      <w:r>
+        <w:rPr>
+          <w:color w:val="1A1A1A"/>
+          <w:sz w:val="24"/>
+        </w:rPr>
+        <w:t>So I'm teaching weekend retreats, and come the year 2000, I decide, look, I've got to sort this out. I go on a retreat with Sayadaw U Pandita, outside his place, Panditarama, in the middle of Rangoon.</w:t>
+      </w:r>
+    </w:p>
+    <w:p>
+      <w:pPr>
+        <w:spacing w:line="336" w:lineRule="auto" w:after="0"/>
+        <w:ind w:firstLine="454"/>
+        <w:jc w:val="both"/>
+      </w:pPr>
+      <w:r>
+        <w:rPr>
+          <w:color w:val="1A1A1A"/>
+          <w:sz w:val="24"/>
+        </w:rPr>
+        <w:t>When you go on retreat with a problem, you don't think about the problem. You just go on retreat. And whatever is causing the problem will, in fact, just sort itself out. In other words, what's causing the problem is confusion. That's what's normally the problem. If you just sit with it, if you just stay with it—as confusion, as fear of making a decision—eventually it just sorts itself out.</w:t>
+      </w:r>
+    </w:p>
+    <w:p>
+      <w:pPr>
+        <w:spacing w:line="336" w:lineRule="auto" w:after="0"/>
+        <w:ind w:firstLine="454"/>
+        <w:jc w:val="both"/>
+      </w:pPr>
+      <w:r>
+        <w:rPr>
+          <w:color w:val="1A1A1A"/>
+          <w:sz w:val="24"/>
+        </w:rPr>
+        <w:t>That was another rotten retreat. Six weeks of misery. And then when it passed, it was lovely and peaceful for a week.</w:t>
+      </w:r>
+    </w:p>
+    <w:p>
+      <w:pPr>
+        <w:spacing w:line="336" w:lineRule="auto" w:after="0"/>
+        <w:ind w:firstLine="454"/>
+        <w:jc w:val="both"/>
+      </w:pPr>
+      <w:r>
+        <w:rPr>
+          <w:color w:val="1A1A1A"/>
+          <w:sz w:val="24"/>
+        </w:rPr>
+        <w:t>I'm down at the end of the retreat and I'm in the hall there and I'm looking at the bookcase and my eye falls on this book. It's all the stuff on teaching that's taken out of A Course in Miracles. Some of you might know that book, A Course in Miracles. It's a big book and it's got a teacher's book with it.</w:t>
+      </w:r>
+    </w:p>
+    <w:p>
+      <w:pPr>
+        <w:spacing w:line="336" w:lineRule="auto" w:after="0"/>
+        <w:ind w:firstLine="454"/>
+        <w:jc w:val="both"/>
+      </w:pPr>
+      <w:r>
+        <w:rPr>
+          <w:color w:val="1A1A1A"/>
+          <w:sz w:val="24"/>
+        </w:rPr>
+        <w:t>I pick it out and I'm reading it, and by the end of that book I'm absolutely certain that what I've got to do is teach. How weird. It happens, doesn't it? You've got this problem, and you call for help, and the answer comes. It comes in its own time.</w:t>
+      </w:r>
+    </w:p>
+    <w:p>
+      <w:pPr>
+        <w:spacing w:line="336" w:lineRule="auto" w:after="0"/>
+        <w:ind w:firstLine="454"/>
+        <w:jc w:val="both"/>
+      </w:pPr>
+      <w:r>
+        <w:rPr>
+          <w:color w:val="1A1A1A"/>
+          <w:sz w:val="24"/>
+        </w:rPr>
+        <w:t>So I get back to Britain. I go back to the Vihara. I set up a little trust. And before we know it, we've collected twenty-five thousand pounds to open a centre.</w:t>
+      </w:r>
+    </w:p>
+    <w:p>
+      <w:pPr>
+        <w:spacing w:line="336" w:lineRule="auto" w:after="0"/>
+        <w:ind w:firstLine="454"/>
+        <w:jc w:val="both"/>
+      </w:pPr>
+      <w:r>
+        <w:rPr>
+          <w:color w:val="1A1A1A"/>
+          <w:sz w:val="24"/>
+        </w:rPr>
+        <w:t>And that's where the big mistake comes. I open up in the north of London. All my support is in the south. I completely forget that London is not a city. It's a collection of villages. And you don't go from the south to the north for an evening meeting. That's a two-hour journey.</w:t>
+      </w:r>
+    </w:p>
+    <w:p>
+      <w:pPr>
+        <w:spacing w:line="336" w:lineRule="auto" w:after="0"/>
+        <w:ind w:firstLine="454"/>
+        <w:jc w:val="both"/>
+      </w:pPr>
+      <w:r>
+        <w:rPr>
+          <w:color w:val="1A1A1A"/>
+          <w:sz w:val="24"/>
+        </w:rPr>
+        <w:t>So on the opening day, thirty-odd people came. And what happened was they never came again. They never came again, and that's it.</w:t>
+      </w:r>
+    </w:p>
+    <w:p>
+      <w:pPr>
+        <w:spacing w:line="336" w:lineRule="auto" w:after="0"/>
+        <w:ind w:firstLine="454"/>
+        <w:jc w:val="both"/>
+      </w:pPr>
+      <w:r>
+        <w:rPr>
+          <w:color w:val="1A1A1A"/>
+          <w:sz w:val="24"/>
+        </w:rPr>
+        <w:t>Come September, Mattesh, a Dutch student doing a PhD at one of the London universities—he was very good, he supported me all the way, a lovely man—I said to him, if we don't have somebody by the end of September, we're not going to have a group.</w:t>
+      </w:r>
+    </w:p>
+    <w:p>
+      <w:pPr>
+        <w:spacing w:line="336" w:lineRule="auto" w:after="0"/>
+        <w:ind w:firstLine="454"/>
+        <w:jc w:val="both"/>
+      </w:pPr>
+      <w:r>
+        <w:rPr>
+          <w:color w:val="1A1A1A"/>
+          <w:sz w:val="24"/>
+        </w:rPr>
+        <w:t>So we advertised all over the place, made these little stickers. I had two young fellas, and they cycled everywhere. They put these stickers everywhere—laundrettes, libraries, everywhere. And they had the wrong telephone number. Yes, you learn, you learn.</w:t>
+      </w:r>
+    </w:p>
+    <w:p>
+      <w:pPr>
+        <w:spacing w:line="336" w:lineRule="auto" w:after="0"/>
+        <w:ind w:firstLine="454"/>
+        <w:jc w:val="both"/>
+      </w:pPr>
+      <w:r>
+        <w:rPr>
+          <w:color w:val="1A1A1A"/>
+          <w:sz w:val="24"/>
+        </w:rPr>
+        <w:t>The first night the neighbour came, and he never came again. The second night nobody came. So by October I'm thinking this is a disaster.</w:t>
+      </w:r>
+    </w:p>
+    <w:p>
+      <w:pPr>
+        <w:spacing w:line="336" w:lineRule="auto" w:after="0"/>
+        <w:ind w:firstLine="454"/>
+        <w:jc w:val="both"/>
+      </w:pPr>
+      <w:r>
+        <w:rPr>
+          <w:color w:val="1A1A1A"/>
+          <w:sz w:val="24"/>
+        </w:rPr>
+        <w:t>By the end of that season the Sri Lankans had come to help us, especially Sita—Dr. Sita Sriwarni. She was always there helping me. Then we had this six-week retreat over winter. We closed the place down. There were five of us. And I decided that it was not going to work. I've got to get out.</w:t>
+      </w:r>
+    </w:p>
+    <w:p>
+      <w:pPr>
+        <w:spacing w:line="336" w:lineRule="auto" w:after="0"/>
+        <w:ind w:firstLine="454"/>
+        <w:jc w:val="both"/>
+      </w:pPr>
+      <w:r>
+        <w:rPr>
+          <w:color w:val="1A1A1A"/>
+          <w:sz w:val="24"/>
+        </w:rPr>
+        <w:t>Luckily, there was a man who was on retreat with me, Peter, who knew the Batchelors. He got in touch with them—that's Stephen and Martine. Some of you might have read their books and might know them. He told them that the next cosmic Buddha was in the north of London. So there you go.</w:t>
+      </w:r>
+    </w:p>
+    <w:p>
+      <w:pPr>
+        <w:spacing w:line="336" w:lineRule="auto" w:after="0"/>
+        <w:ind w:firstLine="454"/>
+        <w:jc w:val="both"/>
+      </w:pPr>
+      <w:r>
+        <w:rPr>
+          <w:color w:val="1A1A1A"/>
+          <w:sz w:val="24"/>
+        </w:rPr>
+        <w:t>They came up to see me, and it was just one of those lovely times when Gaia House was stuck. The Batchelors had moved to France. They needed somebody there to look after the personals, about twelve personals.</w:t>
+      </w:r>
+    </w:p>
+    <w:p>
+      <w:pPr>
+        <w:spacing w:line="336" w:lineRule="auto" w:after="0"/>
+        <w:ind w:firstLine="454"/>
+        <w:jc w:val="both"/>
+      </w:pPr>
+      <w:r>
+        <w:rPr>
+          <w:color w:val="1A1A1A"/>
+          <w:sz w:val="24"/>
+        </w:rPr>
+        <w:t>I went to see Christina Feldman, and I thought it was a great place. When I was there, it became really my Dharma teacher centre, my Dharma college. Because not only was I treating with people who had come on personal retreat—some of them were ill with ME and things like that, some had psychological problems, not mental illnesses, but passing depressions and lots of stuff—I also had to deal with some of the managers who were running the place. And I was given the chance to run these eight-week retreats in the Mahasi system twice a year.</w:t>
+      </w:r>
+    </w:p>
+    <w:p>
+      <w:pPr>
+        <w:spacing w:line="336" w:lineRule="auto" w:after="0"/>
+        <w:ind w:firstLine="454"/>
+        <w:jc w:val="both"/>
+      </w:pPr>
+      <w:r>
+        <w:rPr>
+          <w:color w:val="1A1A1A"/>
+          <w:sz w:val="24"/>
+        </w:rPr>
+        <w:t>It was during that time that I realised there was a little space to start something like this.</w:t>
+      </w:r>
+    </w:p>
+    <w:p>
+      <w:pPr>
+        <w:spacing w:line="336" w:lineRule="auto" w:after="0"/>
+        <w:ind w:firstLine="454"/>
+        <w:jc w:val="both"/>
+      </w:pPr>
+      <w:r>
+        <w:rPr>
+          <w:color w:val="1A1A1A"/>
+          <w:sz w:val="24"/>
+        </w:rPr>
+        <w:t>After about a year or two, I decided to leave. I was never really fully into the teachers' organisation there because it's a very lay organisation. Again, I came to a choice as to whether to disrobe and become a lay teacher or to remain a monk. It was a bit like—for those of you who know the imagery—being a Catholic priest amongst Quakers.</w:t>
+      </w:r>
+    </w:p>
+    <w:p>
+      <w:pPr>
+        <w:spacing w:line="336" w:lineRule="auto" w:after="0"/>
+        <w:ind w:firstLine="454"/>
+        <w:jc w:val="both"/>
+      </w:pPr>
+      <w:r>
+        <w:rPr>
+          <w:color w:val="1A1A1A"/>
+          <w:sz w:val="24"/>
+        </w:rPr>
+        <w:t>So I decided to leave. Then we just went through the whole business of a trust. I have a special thanks to Anne Ashton, who was the accounts person at Gaia House. She took us through this whole process with a lawyer. We got a lawyer from down in London—a simple letter to the charitable trust and we had it. It only cost us two and a half thousand pounds, and then we set it up.</w:t>
+      </w:r>
+    </w:p>
+    <w:p>
+      <w:pPr>
+        <w:spacing w:line="336" w:lineRule="auto" w:after="0"/>
+        <w:ind w:firstLine="454"/>
+        <w:jc w:val="both"/>
+      </w:pPr>
+      <w:r>
+        <w:rPr>
+          <w:color w:val="1A1A1A"/>
+          <w:sz w:val="24"/>
+        </w:rPr>
+        <w:t>Well, then it's just history, isn't it? I find this place, and from then on I think it's all about...</w:t>
+      </w:r>
+    </w:p>
+    <w:p>
+      <w:pPr>
+        <w:spacing w:line="336" w:lineRule="auto" w:after="0"/>
+        <w:ind w:firstLine="454"/>
+        <w:jc w:val="both"/>
+      </w:pPr>
+      <w:r>
+        <w:rPr>
+          <w:color w:val="1A1A1A"/>
+          <w:sz w:val="24"/>
+        </w:rPr>
+        <w:t>So you might ask now, after all this, where am I? Everybody wants to know where you are.</w:t>
+      </w:r>
+    </w:p>
+    <w:p>
+      <w:pPr>
+        <w:spacing w:line="336" w:lineRule="auto" w:after="0"/>
+        <w:ind w:firstLine="454"/>
+        <w:jc w:val="both"/>
+      </w:pPr>
+      <w:r>
+        <w:rPr>
+          <w:color w:val="1A1A1A"/>
+          <w:sz w:val="24"/>
+        </w:rPr>
+        <w:t>The Buddha gives this image of an ocean in which beings are swimming underneath, completely lost. Others bob their head up and down, and some are stable, and they can see there's an island. An island which is both in, but not of, this world.</w:t>
+      </w:r>
+    </w:p>
+    <w:p>
+      <w:pPr>
+        <w:spacing w:line="336" w:lineRule="auto" w:after="0"/>
+        <w:ind w:firstLine="454"/>
+        <w:jc w:val="both"/>
+      </w:pPr>
+      <w:r>
+        <w:rPr>
+          <w:color w:val="1A1A1A"/>
+          <w:sz w:val="24"/>
+        </w:rPr>
+        <w:t>Now for me, it wasn't an ocean—it's been a swamp. I'm stuck in this swamp with crocodiles, and every so often there's a bit of a clearing, and that's it.</w:t>
+      </w:r>
+    </w:p>
+    <w:p>
+      <w:pPr>
+        <w:spacing w:line="336" w:lineRule="auto" w:after="0"/>
+        <w:ind w:firstLine="454"/>
+        <w:jc w:val="both"/>
+      </w:pPr>
+      <w:r>
+        <w:rPr>
+          <w:color w:val="1A1A1A"/>
+          <w:sz w:val="24"/>
+        </w:rPr>
+        <w:t>All I can say is that I know where the island is. That's the important thing. I know where the island is. Does that mean I'm making a beeline for it? Not at all. I slip over here, slip over there, I sometimes turn my back on it. But generally speaking, I'm on the way. So that's where you've got to get to.</w:t>
+      </w:r>
+    </w:p>
+    <w:p>
+      <w:pPr>
+        <w:spacing w:line="336" w:lineRule="auto" w:after="0"/>
+        <w:ind w:firstLine="454"/>
+        <w:jc w:val="both"/>
+      </w:pPr>
+      <w:r>
+        <w:rPr>
+          <w:color w:val="1A1A1A"/>
+          <w:sz w:val="24"/>
+        </w:rPr>
+        <w:t>You can see how I just stumbled and bumbled and blundered my way through life, but not without lots of summery somersaults and sticky toffee pudding with custard. And I've landed here in an area of outstanding natural beauty. It's not bad, is it?</w:t>
+      </w:r>
+    </w:p>
+    <w:p>
+      <w:pPr>
+        <w:spacing w:line="336" w:lineRule="auto" w:after="0"/>
+        <w:ind w:firstLine="454"/>
+        <w:jc w:val="both"/>
+      </w:pPr>
+      <w:r>
+        <w:rPr>
+          <w:color w:val="1A1A1A"/>
+          <w:sz w:val="24"/>
+        </w:rPr>
+        <w:t>Anyway, so now there are two things. I wanted to talk about some of my spiritual experience, because I want to really release people from keeping it to themselves. Often I get meditators come to me and tell me similar things to what I've told you, and I've said, have you told anybody? They say, no, it's only just for me. Because there isn't that framework within which they feel free to express themselves.</w:t>
+      </w:r>
+    </w:p>
+    <w:p>
+      <w:pPr>
+        <w:spacing w:line="336" w:lineRule="auto" w:after="0"/>
+        <w:ind w:firstLine="454"/>
+        <w:jc w:val="both"/>
+      </w:pPr>
+      <w:r>
+        <w:rPr>
+          <w:color w:val="1A1A1A"/>
+          <w:sz w:val="24"/>
+        </w:rPr>
+        <w:t>And often, of course, if they can't, they get into what's known as a spiritual emergency, where it just sends them offline and they end up with a doctor. And if the doctor's not sympathetic, of course, you're back on drugs. It's a psychotic interlude or something.</w:t>
+      </w:r>
+    </w:p>
+    <w:p>
+      <w:pPr>
+        <w:spacing w:line="336" w:lineRule="auto" w:after="0"/>
+        <w:ind w:firstLine="454"/>
+        <w:jc w:val="both"/>
+      </w:pPr>
+      <w:r>
+        <w:rPr>
+          <w:color w:val="1A1A1A"/>
+          <w:sz w:val="24"/>
+        </w:rPr>
+        <w:t>So be much more open about out-of-body experiences. I go to Gaia House and occasionally I'll ask a group of twenty-five how many people have had out-of-body experiences. Five hands go up. Now, I wouldn't say that's the same percentage for the general population, but it's not an unknown experience.</w:t>
+      </w:r>
+    </w:p>
+    <w:p>
+      <w:pPr>
+        <w:spacing w:line="336" w:lineRule="auto" w:after="0"/>
+        <w:ind w:firstLine="454"/>
+        <w:jc w:val="both"/>
+      </w:pPr>
+      <w:r>
+        <w:rPr>
+          <w:color w:val="1A1A1A"/>
+          <w:sz w:val="24"/>
+        </w:rPr>
+        <w:t>And so finally, what is it that I would really like to pass on to you? What is it I've come to know?</w:t>
+      </w:r>
+    </w:p>
+    <w:p>
+      <w:pPr>
+        <w:spacing w:line="336" w:lineRule="auto" w:after="0"/>
+        <w:ind w:firstLine="454"/>
+        <w:jc w:val="both"/>
+      </w:pPr>
+      <w:r>
+        <w:rPr>
+          <w:color w:val="1A1A1A"/>
+          <w:sz w:val="24"/>
+        </w:rPr>
+        <w:t>I've come to realise that the difference between me and the Buddha is one of degree and not of kind. And that the difference between me and you is the same. And that the difference between us and all sentient beings, all these animals—if you look into their eyes, the mirrors, the windows to the soul—you'll see they have this intelligence.</w:t>
+      </w:r>
+    </w:p>
+    <w:p>
+      <w:pPr>
+        <w:spacing w:line="336" w:lineRule="auto" w:after="0"/>
+        <w:ind w:firstLine="454"/>
+        <w:jc w:val="both"/>
+      </w:pPr>
+      <w:r>
+        <w:rPr>
+          <w:color w:val="1A1A1A"/>
+          <w:sz w:val="24"/>
+        </w:rPr>
+        <w:t>And because of that, the force that lies in us all is to seek happiness. And because we're deluded, we create all this suffering, but at some point there has to be a turning. You turn round upon it, and at some point in your life you're pushed by your own suffering to move towards the end of it.</w:t>
+      </w:r>
+    </w:p>
+    <w:p>
+      <w:pPr>
+        <w:spacing w:line="336" w:lineRule="auto" w:after="0"/>
+        <w:ind w:firstLine="454"/>
+        <w:jc w:val="both"/>
+      </w:pPr>
+      <w:r>
+        <w:rPr>
+          <w:color w:val="1A1A1A"/>
+          <w:sz w:val="24"/>
+        </w:rPr>
+        <w:t>Now Kant has this little phrase called a categorical imperative. He's talking about the moral law, whereby if you make a moral law—like for instance not to steal—that is unconditionally and completely applicable to all human beings. In the category of stealing, it is an imperative, a command that all human beings obey that. You can't say one human being can steal and others can't.</w:t>
+      </w:r>
+    </w:p>
+    <w:p>
+      <w:pPr>
+        <w:spacing w:line="336" w:lineRule="auto" w:after="0"/>
+        <w:ind w:firstLine="454"/>
+        <w:jc w:val="both"/>
+      </w:pPr>
+      <w:r>
+        <w:rPr>
+          <w:color w:val="1A1A1A"/>
+          <w:sz w:val="24"/>
+        </w:rPr>
+        <w:t>So I would like to say that it is a categorical imperative that all beings, all sentient beings, will become fully liberated from all suffering forever. Absolutely.</w:t>
+      </w:r>
+    </w:p>
+    <w:p>
+      <w:pPr>
+        <w:spacing w:line="336" w:lineRule="auto" w:after="0"/>
+        <w:ind w:firstLine="454"/>
+        <w:jc w:val="both"/>
+      </w:pPr>
+      <w:r>
+        <w:rPr>
+          <w:color w:val="1A1A1A"/>
+          <w:sz w:val="24"/>
+        </w:rPr>
+        <w:t>I can only hope my words have been of some assistance, that they have not caused confusion and befuddlement, and that you will, by your devotion to the practice—unrelenting, unremitting devotion to the practice—come to the end of suffering forever, sooner rather than later.</w:t>
+      </w:r>
+    </w:p>
+    <w:p>
+      <w:pPr>
+        <w:spacing w:line="336" w:lineRule="auto" w:after="0"/>
+        <w:ind w:firstLine="454"/>
+        <w:jc w:val="both"/>
+      </w:pPr>
+      <w:r>
+        <w:rPr>
+          <w:color w:val="1A1A1A"/>
+          <w:sz w:val="24"/>
+        </w:rPr>
+        <w:t>Sādhu, sādhu, sādhu.</w:t>
       </w:r>
     </w:p>
     <w:p/>

</xml_diff>